<commit_message>
SCED package: add Table 1 and military R&D in Figure 5
- Table 1 (average annual growth rates, Section 4.1) is now computed from
  the regression data, in R (section 7.1) and Stata (section 7), and checked
  by check_stata_vs_R.R.
- dataset_paperSCED.dta gains GVA_man, Emp_man and GDP in levels, used only
  for Table 1; the regression variables are unchanged.
- Figure 5 has a third row with the coefficients of military R&D.
- README updated (variables, extrapolation formula, outputs).

Co-Authored-By: Claude Opus 5.5 <noreply@anthropic.com>
</commit_message>
<xml_diff>
--- a/StamegnaEtAl2026_SCED/output/R/SCED_tables.docx
+++ b/StamegnaEtAl2026_SCED/output/R/SCED_tables.docx
@@ -25,7 +25,7 @@
           <w:szCs w:val="28"/>
           <w:color w:val="000000"/>
         </w:rPr>
-        <w:t xml:space="preserve">SCED: regression tables</w:t>
+        <w:t xml:space="preserve">SCED: tables</w:t>
       </w:r>
     </w:p>
     <w:p>
@@ -52,6 +52,2760 @@
           <w:color w:val="000000"/>
         </w:rPr>
         <w:t xml:space="preserve">Generated by SCED_replication.R. Main model: country fixed effects with AR(1) errors. Robustness: pooled model with AR(1) errors.</w:t>
+      </w:r>
+    </w:p>
+    <w:p>
+      <w:pPr>
+        <w:jc w:val="left"/>
+        <w:pBdr>
+          <w:bottom w:val="none" w:sz="0" w:space="0" w:color="000000"/>
+          <w:top w:val="none" w:sz="0" w:space="0" w:color="000000"/>
+          <w:left w:val="none" w:sz="0" w:space="0" w:color="000000"/>
+          <w:right w:val="none" w:sz="0" w:space="0" w:color="000000"/>
+        </w:pBdr>
+        <w:spacing w:after="0" w:before="0" w:line="240"/>
+        <w:ind w:left="0" w:right="0" w:firstLine="0" w:firstLineChars="0"/>
+      </w:pPr>
+      <w:r>
+        <w:rPr>
+          <w:rFonts w:ascii="Times New Roman" w:hAnsi="Times New Roman" w:eastAsia="Times New Roman" w:cs="Times New Roman"/>
+          <w:i w:val="false"/>
+          <w:b w:val="true"/>
+          <w:u w:val="none"/>
+          <w:strike w:val="false"/>
+          <w:sz w:val="20"/>
+          <w:szCs w:val="20"/>
+          <w:color w:val="000000"/>
+        </w:rPr>
+        <w:t xml:space="preserve">Table 1. Average annual growth rates of selected manufacturing indicators, 1981-2024 (%)</w:t>
+      </w:r>
+    </w:p>
+    <w:tbl xmlns:a="http://schemas.openxmlformats.org/drawingml/2006/main" xmlns:pic="http://schemas.openxmlformats.org/drawingml/2006/picture">
+      <w:tblPr>
+        <w:tblLayout w:type="fixed"/>
+        <w:jc w:val="center"/>
+        <w:tblLook w:firstRow="1" w:lastRow="0" w:firstColumn="0" w:lastColumn="0" w:noHBand="0" w:noVBand="1"/>
+      </w:tblPr>
+      <w:tblGrid>
+        <w:gridCol w:w="1080"/>
+        <w:gridCol w:w="1080"/>
+        <w:gridCol w:w="1080"/>
+        <w:gridCol w:w="1080"/>
+        <w:gridCol w:w="1080"/>
+        <w:gridCol w:w="1080"/>
+      </w:tblGrid>
+      <w:tr>
+        <w:trPr>
+          <w:trHeight w:val="360" w:hRule="auto"/>
+          <w:tblHeader/>
+        </w:trPr>
+        <w:tc>
+          <w:tcPr>
+            <w:tcBorders>
+              <w:bottom w:val="single" w:sz="12" w:space="0" w:color="666666"/>
+              <w:top w:val="single" w:sz="12" w:space="0" w:color="666666"/>
+              <w:left w:val="none" w:sz="0" w:space="0" w:color="000000"/>
+              <w:right w:val="none" w:sz="0" w:space="0" w:color="000000"/>
+            </w:tcBorders>
+            <w:shd w:val="clear" w:color="auto" w:fill="FFFFFF"/>
+            <w:tcMar>
+              <w:top w:w="0" w:type="dxa"/>
+              <w:bottom w:w="0" w:type="dxa"/>
+              <w:left w:w="0" w:type="dxa"/>
+              <w:right w:w="0" w:type="dxa"/>
+            </w:tcMar>
+            <w:vAlign w:val="center"/>
+          </w:tcPr>
+          <w:p>
+            <w:pPr>
+              <w:pStyle w:val="Normal"/>
+              <w:jc w:val="left"/>
+              <w:pBdr>
+                <w:bottom w:val="none" w:sz="0" w:space="0" w:color="000000"/>
+                <w:top w:val="none" w:sz="0" w:space="0" w:color="000000"/>
+                <w:left w:val="none" w:sz="0" w:space="0" w:color="000000"/>
+                <w:right w:val="none" w:sz="0" w:space="0" w:color="000000"/>
+              </w:pBdr>
+              <w:spacing w:after="100" w:before="100" w:line="240"/>
+              <w:ind w:left="100" w:right="100" w:firstLine="0" w:firstLineChars="0"/>
+              <w:rPr>
+                <w:rFonts w:ascii="Times New Roman" w:hAnsi="Times New Roman" w:eastAsia="Times New Roman" w:cs="Times New Roman"/>
+                <w:i w:val="false"/>
+                <w:b w:val="false"/>
+                <w:u w:val="none"/>
+                <w:strike w:val="false"/>
+                <w:sz w:val="18"/>
+                <w:szCs w:val="18"/>
+                <w:color w:val="000000"/>
+              </w:rPr>
+            </w:pPr>
+            <w:r>
+              <w:rPr>
+                <w:rFonts w:ascii="Times New Roman" w:hAnsi="Times New Roman" w:eastAsia="Times New Roman" w:cs="Times New Roman"/>
+                <w:i w:val="false"/>
+                <w:b w:val="false"/>
+                <w:u w:val="none"/>
+                <w:strike w:val="false"/>
+                <w:sz w:val="18"/>
+                <w:szCs w:val="18"/>
+                <w:color w:val="000000"/>
+              </w:rPr>
+              <w:t xml:space="preserve">Country</w:t>
+            </w:r>
+          </w:p>
+        </w:tc>
+        <w:tc>
+          <w:tcPr>
+            <w:tcBorders>
+              <w:bottom w:val="single" w:sz="12" w:space="0" w:color="666666"/>
+              <w:top w:val="single" w:sz="12" w:space="0" w:color="666666"/>
+              <w:left w:val="none" w:sz="0" w:space="0" w:color="000000"/>
+              <w:right w:val="none" w:sz="0" w:space="0" w:color="000000"/>
+            </w:tcBorders>
+            <w:shd w:val="clear" w:color="auto" w:fill="FFFFFF"/>
+            <w:tcMar>
+              <w:top w:w="0" w:type="dxa"/>
+              <w:bottom w:w="0" w:type="dxa"/>
+              <w:left w:w="0" w:type="dxa"/>
+              <w:right w:w="0" w:type="dxa"/>
+            </w:tcMar>
+            <w:vAlign w:val="center"/>
+          </w:tcPr>
+          <w:p>
+            <w:pPr>
+              <w:pStyle w:val="Normal"/>
+              <w:jc w:val="left"/>
+              <w:pBdr>
+                <w:bottom w:val="none" w:sz="0" w:space="0" w:color="000000"/>
+                <w:top w:val="none" w:sz="0" w:space="0" w:color="000000"/>
+                <w:left w:val="none" w:sz="0" w:space="0" w:color="000000"/>
+                <w:right w:val="none" w:sz="0" w:space="0" w:color="000000"/>
+              </w:pBdr>
+              <w:spacing w:after="100" w:before="100" w:line="240"/>
+              <w:ind w:left="100" w:right="100" w:firstLine="0" w:firstLineChars="0"/>
+              <w:rPr>
+                <w:rFonts w:ascii="Times New Roman" w:hAnsi="Times New Roman" w:eastAsia="Times New Roman" w:cs="Times New Roman"/>
+                <w:i w:val="false"/>
+                <w:b w:val="false"/>
+                <w:u w:val="none"/>
+                <w:strike w:val="false"/>
+                <w:sz w:val="18"/>
+                <w:szCs w:val="18"/>
+                <w:color w:val="000000"/>
+              </w:rPr>
+            </w:pPr>
+            <w:r>
+              <w:rPr>
+                <w:rFonts w:ascii="Times New Roman" w:hAnsi="Times New Roman" w:eastAsia="Times New Roman" w:cs="Times New Roman"/>
+                <w:i w:val="false"/>
+                <w:b w:val="false"/>
+                <w:u w:val="none"/>
+                <w:strike w:val="false"/>
+                <w:sz w:val="18"/>
+                <w:szCs w:val="18"/>
+                <w:color w:val="000000"/>
+              </w:rPr>
+              <w:t xml:space="preserve">Years</w:t>
+            </w:r>
+          </w:p>
+        </w:tc>
+        <w:tc>
+          <w:tcPr>
+            <w:tcBorders>
+              <w:bottom w:val="single" w:sz="12" w:space="0" w:color="666666"/>
+              <w:top w:val="single" w:sz="12" w:space="0" w:color="666666"/>
+              <w:left w:val="none" w:sz="0" w:space="0" w:color="000000"/>
+              <w:right w:val="none" w:sz="0" w:space="0" w:color="000000"/>
+            </w:tcBorders>
+            <w:shd w:val="clear" w:color="auto" w:fill="FFFFFF"/>
+            <w:tcMar>
+              <w:top w:w="0" w:type="dxa"/>
+              <w:bottom w:w="0" w:type="dxa"/>
+              <w:left w:w="0" w:type="dxa"/>
+              <w:right w:w="0" w:type="dxa"/>
+            </w:tcMar>
+            <w:vAlign w:val="center"/>
+          </w:tcPr>
+          <w:p>
+            <w:pPr>
+              <w:pStyle w:val="Normal"/>
+              <w:jc w:val="center"/>
+              <w:pBdr>
+                <w:bottom w:val="none" w:sz="0" w:space="0" w:color="000000"/>
+                <w:top w:val="none" w:sz="0" w:space="0" w:color="000000"/>
+                <w:left w:val="none" w:sz="0" w:space="0" w:color="000000"/>
+                <w:right w:val="none" w:sz="0" w:space="0" w:color="000000"/>
+              </w:pBdr>
+              <w:spacing w:after="100" w:before="100" w:line="240"/>
+              <w:ind w:left="100" w:right="100" w:firstLine="0" w:firstLineChars="0"/>
+              <w:rPr>
+                <w:rFonts w:ascii="Times New Roman" w:hAnsi="Times New Roman" w:eastAsia="Times New Roman" w:cs="Times New Roman"/>
+                <w:i w:val="false"/>
+                <w:b w:val="false"/>
+                <w:u w:val="none"/>
+                <w:strike w:val="false"/>
+                <w:sz w:val="18"/>
+                <w:szCs w:val="18"/>
+                <w:color w:val="000000"/>
+              </w:rPr>
+            </w:pPr>
+            <w:r>
+              <w:rPr>
+                <w:rFonts w:ascii="Times New Roman" w:hAnsi="Times New Roman" w:eastAsia="Times New Roman" w:cs="Times New Roman"/>
+                <w:i w:val="false"/>
+                <w:b w:val="false"/>
+                <w:u w:val="none"/>
+                <w:strike w:val="false"/>
+                <w:sz w:val="18"/>
+                <w:szCs w:val="18"/>
+                <w:color w:val="000000"/>
+              </w:rPr>
+              <w:t xml:space="preserve">GVA</w:t>
+            </w:r>
+          </w:p>
+        </w:tc>
+        <w:tc>
+          <w:tcPr>
+            <w:tcBorders>
+              <w:bottom w:val="single" w:sz="12" w:space="0" w:color="666666"/>
+              <w:top w:val="single" w:sz="12" w:space="0" w:color="666666"/>
+              <w:left w:val="none" w:sz="0" w:space="0" w:color="000000"/>
+              <w:right w:val="none" w:sz="0" w:space="0" w:color="000000"/>
+            </w:tcBorders>
+            <w:shd w:val="clear" w:color="auto" w:fill="FFFFFF"/>
+            <w:tcMar>
+              <w:top w:w="0" w:type="dxa"/>
+              <w:bottom w:w="0" w:type="dxa"/>
+              <w:left w:w="0" w:type="dxa"/>
+              <w:right w:w="0" w:type="dxa"/>
+            </w:tcMar>
+            <w:vAlign w:val="center"/>
+          </w:tcPr>
+          <w:p>
+            <w:pPr>
+              <w:pStyle w:val="Normal"/>
+              <w:jc w:val="center"/>
+              <w:pBdr>
+                <w:bottom w:val="none" w:sz="0" w:space="0" w:color="000000"/>
+                <w:top w:val="none" w:sz="0" w:space="0" w:color="000000"/>
+                <w:left w:val="none" w:sz="0" w:space="0" w:color="000000"/>
+                <w:right w:val="none" w:sz="0" w:space="0" w:color="000000"/>
+              </w:pBdr>
+              <w:spacing w:after="100" w:before="100" w:line="240"/>
+              <w:ind w:left="100" w:right="100" w:firstLine="0" w:firstLineChars="0"/>
+              <w:rPr>
+                <w:rFonts w:ascii="Times New Roman" w:hAnsi="Times New Roman" w:eastAsia="Times New Roman" w:cs="Times New Roman"/>
+                <w:i w:val="false"/>
+                <w:b w:val="false"/>
+                <w:u w:val="none"/>
+                <w:strike w:val="false"/>
+                <w:sz w:val="18"/>
+                <w:szCs w:val="18"/>
+                <w:color w:val="000000"/>
+              </w:rPr>
+            </w:pPr>
+            <w:r>
+              <w:rPr>
+                <w:rFonts w:ascii="Times New Roman" w:hAnsi="Times New Roman" w:eastAsia="Times New Roman" w:cs="Times New Roman"/>
+                <w:i w:val="false"/>
+                <w:b w:val="false"/>
+                <w:u w:val="none"/>
+                <w:strike w:val="false"/>
+                <w:sz w:val="18"/>
+                <w:szCs w:val="18"/>
+                <w:color w:val="000000"/>
+              </w:rPr>
+              <w:t xml:space="preserve">Employment</w:t>
+            </w:r>
+          </w:p>
+        </w:tc>
+        <w:tc>
+          <w:tcPr>
+            <w:tcBorders>
+              <w:bottom w:val="single" w:sz="12" w:space="0" w:color="666666"/>
+              <w:top w:val="single" w:sz="12" w:space="0" w:color="666666"/>
+              <w:left w:val="none" w:sz="0" w:space="0" w:color="000000"/>
+              <w:right w:val="none" w:sz="0" w:space="0" w:color="000000"/>
+            </w:tcBorders>
+            <w:shd w:val="clear" w:color="auto" w:fill="FFFFFF"/>
+            <w:tcMar>
+              <w:top w:w="0" w:type="dxa"/>
+              <w:bottom w:w="0" w:type="dxa"/>
+              <w:left w:w="0" w:type="dxa"/>
+              <w:right w:w="0" w:type="dxa"/>
+            </w:tcMar>
+            <w:vAlign w:val="center"/>
+          </w:tcPr>
+          <w:p>
+            <w:pPr>
+              <w:pStyle w:val="Normal"/>
+              <w:jc w:val="center"/>
+              <w:pBdr>
+                <w:bottom w:val="none" w:sz="0" w:space="0" w:color="000000"/>
+                <w:top w:val="none" w:sz="0" w:space="0" w:color="000000"/>
+                <w:left w:val="none" w:sz="0" w:space="0" w:color="000000"/>
+                <w:right w:val="none" w:sz="0" w:space="0" w:color="000000"/>
+              </w:pBdr>
+              <w:spacing w:after="100" w:before="100" w:line="240"/>
+              <w:ind w:left="100" w:right="100" w:firstLine="0" w:firstLineChars="0"/>
+              <w:rPr>
+                <w:rFonts w:ascii="Times New Roman" w:hAnsi="Times New Roman" w:eastAsia="Times New Roman" w:cs="Times New Roman"/>
+                <w:i w:val="false"/>
+                <w:b w:val="false"/>
+                <w:u w:val="none"/>
+                <w:strike w:val="false"/>
+                <w:sz w:val="18"/>
+                <w:szCs w:val="18"/>
+                <w:color w:val="000000"/>
+              </w:rPr>
+            </w:pPr>
+            <w:r>
+              <w:rPr>
+                <w:rFonts w:ascii="Times New Roman" w:hAnsi="Times New Roman" w:eastAsia="Times New Roman" w:cs="Times New Roman"/>
+                <w:i w:val="false"/>
+                <w:b w:val="false"/>
+                <w:u w:val="none"/>
+                <w:strike w:val="false"/>
+                <w:sz w:val="18"/>
+                <w:szCs w:val="18"/>
+                <w:color w:val="000000"/>
+              </w:rPr>
+              <w:t xml:space="preserve">Productivity</w:t>
+            </w:r>
+          </w:p>
+        </w:tc>
+        <w:tc>
+          <w:tcPr>
+            <w:tcBorders>
+              <w:bottom w:val="single" w:sz="12" w:space="0" w:color="666666"/>
+              <w:top w:val="single" w:sz="12" w:space="0" w:color="666666"/>
+              <w:left w:val="none" w:sz="0" w:space="0" w:color="000000"/>
+              <w:right w:val="none" w:sz="0" w:space="0" w:color="000000"/>
+            </w:tcBorders>
+            <w:shd w:val="clear" w:color="auto" w:fill="FFFFFF"/>
+            <w:tcMar>
+              <w:top w:w="0" w:type="dxa"/>
+              <w:bottom w:w="0" w:type="dxa"/>
+              <w:left w:w="0" w:type="dxa"/>
+              <w:right w:w="0" w:type="dxa"/>
+            </w:tcMar>
+            <w:vAlign w:val="center"/>
+          </w:tcPr>
+          <w:p>
+            <w:pPr>
+              <w:pStyle w:val="Normal"/>
+              <w:jc w:val="center"/>
+              <w:pBdr>
+                <w:bottom w:val="none" w:sz="0" w:space="0" w:color="000000"/>
+                <w:top w:val="none" w:sz="0" w:space="0" w:color="000000"/>
+                <w:left w:val="none" w:sz="0" w:space="0" w:color="000000"/>
+                <w:right w:val="none" w:sz="0" w:space="0" w:color="000000"/>
+              </w:pBdr>
+              <w:spacing w:after="100" w:before="100" w:line="240"/>
+              <w:ind w:left="100" w:right="100" w:firstLine="0" w:firstLineChars="0"/>
+              <w:rPr>
+                <w:rFonts w:ascii="Times New Roman" w:hAnsi="Times New Roman" w:eastAsia="Times New Roman" w:cs="Times New Roman"/>
+                <w:i w:val="false"/>
+                <w:b w:val="false"/>
+                <w:u w:val="none"/>
+                <w:strike w:val="false"/>
+                <w:sz w:val="18"/>
+                <w:szCs w:val="18"/>
+                <w:color w:val="000000"/>
+              </w:rPr>
+            </w:pPr>
+            <w:r>
+              <w:rPr>
+                <w:rFonts w:ascii="Times New Roman" w:hAnsi="Times New Roman" w:eastAsia="Times New Roman" w:cs="Times New Roman"/>
+                <w:i w:val="false"/>
+                <w:b w:val="false"/>
+                <w:u w:val="none"/>
+                <w:strike w:val="false"/>
+                <w:sz w:val="18"/>
+                <w:szCs w:val="18"/>
+                <w:color w:val="000000"/>
+              </w:rPr>
+              <w:t xml:space="preserve">Export</w:t>
+            </w:r>
+          </w:p>
+        </w:tc>
+      </w:tr>
+      <w:tr>
+        <w:trPr>
+          <w:trHeight w:val="360" w:hRule="auto"/>
+        </w:trPr>
+        <w:tc>
+          <w:tcPr>
+            <w:tcBorders>
+              <w:bottom w:val="none" w:sz="0" w:space="0" w:color="000000"/>
+              <w:top w:val="single" w:sz="12" w:space="0" w:color="666666"/>
+              <w:left w:val="none" w:sz="0" w:space="0" w:color="000000"/>
+              <w:right w:val="none" w:sz="0" w:space="0" w:color="000000"/>
+            </w:tcBorders>
+            <w:shd w:val="clear" w:color="auto" w:fill="FFFFFF"/>
+            <w:tcMar>
+              <w:top w:w="0" w:type="dxa"/>
+              <w:bottom w:w="0" w:type="dxa"/>
+              <w:left w:w="0" w:type="dxa"/>
+              <w:right w:w="0" w:type="dxa"/>
+            </w:tcMar>
+            <w:vAlign w:val="center"/>
+          </w:tcPr>
+          <w:p>
+            <w:pPr>
+              <w:pStyle w:val="Normal"/>
+              <w:jc w:val="left"/>
+              <w:pBdr>
+                <w:bottom w:val="none" w:sz="0" w:space="0" w:color="000000"/>
+                <w:top w:val="none" w:sz="0" w:space="0" w:color="000000"/>
+                <w:left w:val="none" w:sz="0" w:space="0" w:color="000000"/>
+                <w:right w:val="none" w:sz="0" w:space="0" w:color="000000"/>
+              </w:pBdr>
+              <w:spacing w:after="100" w:before="100" w:line="240"/>
+              <w:ind w:left="100" w:right="100" w:firstLine="0" w:firstLineChars="0"/>
+              <w:rPr>
+                <w:rFonts w:ascii="Times New Roman" w:hAnsi="Times New Roman" w:eastAsia="Times New Roman" w:cs="Times New Roman"/>
+                <w:i w:val="false"/>
+                <w:b w:val="false"/>
+                <w:u w:val="none"/>
+                <w:strike w:val="false"/>
+                <w:sz w:val="18"/>
+                <w:szCs w:val="18"/>
+                <w:color w:val="000000"/>
+              </w:rPr>
+            </w:pPr>
+            <w:r>
+              <w:rPr>
+                <w:rFonts w:ascii="Times New Roman" w:hAnsi="Times New Roman" w:eastAsia="Times New Roman" w:cs="Times New Roman"/>
+                <w:i w:val="false"/>
+                <w:b w:val="false"/>
+                <w:u w:val="none"/>
+                <w:strike w:val="false"/>
+                <w:sz w:val="18"/>
+                <w:szCs w:val="18"/>
+                <w:color w:val="000000"/>
+              </w:rPr>
+              <w:t xml:space="preserve">Germany</w:t>
+            </w:r>
+          </w:p>
+        </w:tc>
+        <w:tc>
+          <w:tcPr>
+            <w:tcBorders>
+              <w:bottom w:val="none" w:sz="0" w:space="0" w:color="000000"/>
+              <w:top w:val="single" w:sz="12" w:space="0" w:color="666666"/>
+              <w:left w:val="none" w:sz="0" w:space="0" w:color="000000"/>
+              <w:right w:val="none" w:sz="0" w:space="0" w:color="000000"/>
+            </w:tcBorders>
+            <w:shd w:val="clear" w:color="auto" w:fill="FFFFFF"/>
+            <w:tcMar>
+              <w:top w:w="0" w:type="dxa"/>
+              <w:bottom w:w="0" w:type="dxa"/>
+              <w:left w:w="0" w:type="dxa"/>
+              <w:right w:w="0" w:type="dxa"/>
+            </w:tcMar>
+            <w:vAlign w:val="center"/>
+          </w:tcPr>
+          <w:p>
+            <w:pPr>
+              <w:pStyle w:val="Normal"/>
+              <w:jc w:val="left"/>
+              <w:pBdr>
+                <w:bottom w:val="none" w:sz="0" w:space="0" w:color="000000"/>
+                <w:top w:val="none" w:sz="0" w:space="0" w:color="000000"/>
+                <w:left w:val="none" w:sz="0" w:space="0" w:color="000000"/>
+                <w:right w:val="none" w:sz="0" w:space="0" w:color="000000"/>
+              </w:pBdr>
+              <w:spacing w:after="100" w:before="100" w:line="240"/>
+              <w:ind w:left="100" w:right="100" w:firstLine="0" w:firstLineChars="0"/>
+              <w:rPr>
+                <w:rFonts w:ascii="Times New Roman" w:hAnsi="Times New Roman" w:eastAsia="Times New Roman" w:cs="Times New Roman"/>
+                <w:i w:val="false"/>
+                <w:b w:val="false"/>
+                <w:u w:val="none"/>
+                <w:strike w:val="false"/>
+                <w:sz w:val="18"/>
+                <w:szCs w:val="18"/>
+                <w:color w:val="000000"/>
+              </w:rPr>
+            </w:pPr>
+            <w:r>
+              <w:rPr>
+                <w:rFonts w:ascii="Times New Roman" w:hAnsi="Times New Roman" w:eastAsia="Times New Roman" w:cs="Times New Roman"/>
+                <w:i w:val="false"/>
+                <w:b w:val="false"/>
+                <w:u w:val="none"/>
+                <w:strike w:val="false"/>
+                <w:sz w:val="18"/>
+                <w:szCs w:val="18"/>
+                <w:color w:val="000000"/>
+              </w:rPr>
+              <w:t xml:space="preserve">1991-2024</w:t>
+            </w:r>
+          </w:p>
+        </w:tc>
+        <w:tc>
+          <w:tcPr>
+            <w:tcBorders>
+              <w:bottom w:val="none" w:sz="0" w:space="0" w:color="000000"/>
+              <w:top w:val="single" w:sz="12" w:space="0" w:color="666666"/>
+              <w:left w:val="none" w:sz="0" w:space="0" w:color="000000"/>
+              <w:right w:val="none" w:sz="0" w:space="0" w:color="000000"/>
+            </w:tcBorders>
+            <w:shd w:val="clear" w:color="auto" w:fill="FFFFFF"/>
+            <w:tcMar>
+              <w:top w:w="0" w:type="dxa"/>
+              <w:bottom w:w="0" w:type="dxa"/>
+              <w:left w:w="0" w:type="dxa"/>
+              <w:right w:w="0" w:type="dxa"/>
+            </w:tcMar>
+            <w:vAlign w:val="center"/>
+          </w:tcPr>
+          <w:p>
+            <w:pPr>
+              <w:pStyle w:val="Normal"/>
+              <w:jc w:val="center"/>
+              <w:pBdr>
+                <w:bottom w:val="none" w:sz="0" w:space="0" w:color="000000"/>
+                <w:top w:val="none" w:sz="0" w:space="0" w:color="000000"/>
+                <w:left w:val="none" w:sz="0" w:space="0" w:color="000000"/>
+                <w:right w:val="none" w:sz="0" w:space="0" w:color="000000"/>
+              </w:pBdr>
+              <w:spacing w:after="100" w:before="100" w:line="240"/>
+              <w:ind w:left="100" w:right="100" w:firstLine="0" w:firstLineChars="0"/>
+              <w:rPr>
+                <w:rFonts w:ascii="Times New Roman" w:hAnsi="Times New Roman" w:eastAsia="Times New Roman" w:cs="Times New Roman"/>
+                <w:i w:val="false"/>
+                <w:b w:val="false"/>
+                <w:u w:val="none"/>
+                <w:strike w:val="false"/>
+                <w:sz w:val="18"/>
+                <w:szCs w:val="18"/>
+                <w:color w:val="000000"/>
+              </w:rPr>
+            </w:pPr>
+            <w:r>
+              <w:rPr>
+                <w:rFonts w:ascii="Times New Roman" w:hAnsi="Times New Roman" w:eastAsia="Times New Roman" w:cs="Times New Roman"/>
+                <w:i w:val="false"/>
+                <w:b w:val="false"/>
+                <w:u w:val="none"/>
+                <w:strike w:val="false"/>
+                <w:sz w:val="18"/>
+                <w:szCs w:val="18"/>
+                <w:color w:val="000000"/>
+              </w:rPr>
+              <w:t xml:space="preserve">0.51</w:t>
+            </w:r>
+          </w:p>
+        </w:tc>
+        <w:tc>
+          <w:tcPr>
+            <w:tcBorders>
+              <w:bottom w:val="none" w:sz="0" w:space="0" w:color="000000"/>
+              <w:top w:val="single" w:sz="12" w:space="0" w:color="666666"/>
+              <w:left w:val="none" w:sz="0" w:space="0" w:color="000000"/>
+              <w:right w:val="none" w:sz="0" w:space="0" w:color="000000"/>
+            </w:tcBorders>
+            <w:shd w:val="clear" w:color="auto" w:fill="FFFFFF"/>
+            <w:tcMar>
+              <w:top w:w="0" w:type="dxa"/>
+              <w:bottom w:w="0" w:type="dxa"/>
+              <w:left w:w="0" w:type="dxa"/>
+              <w:right w:w="0" w:type="dxa"/>
+            </w:tcMar>
+            <w:vAlign w:val="center"/>
+          </w:tcPr>
+          <w:p>
+            <w:pPr>
+              <w:pStyle w:val="Normal"/>
+              <w:jc w:val="center"/>
+              <w:pBdr>
+                <w:bottom w:val="none" w:sz="0" w:space="0" w:color="000000"/>
+                <w:top w:val="none" w:sz="0" w:space="0" w:color="000000"/>
+                <w:left w:val="none" w:sz="0" w:space="0" w:color="000000"/>
+                <w:right w:val="none" w:sz="0" w:space="0" w:color="000000"/>
+              </w:pBdr>
+              <w:spacing w:after="100" w:before="100" w:line="240"/>
+              <w:ind w:left="100" w:right="100" w:firstLine="0" w:firstLineChars="0"/>
+              <w:rPr>
+                <w:rFonts w:ascii="Times New Roman" w:hAnsi="Times New Roman" w:eastAsia="Times New Roman" w:cs="Times New Roman"/>
+                <w:i w:val="false"/>
+                <w:b w:val="false"/>
+                <w:u w:val="none"/>
+                <w:strike w:val="false"/>
+                <w:sz w:val="18"/>
+                <w:szCs w:val="18"/>
+                <w:color w:val="000000"/>
+              </w:rPr>
+            </w:pPr>
+            <w:r>
+              <w:rPr>
+                <w:rFonts w:ascii="Times New Roman" w:hAnsi="Times New Roman" w:eastAsia="Times New Roman" w:cs="Times New Roman"/>
+                <w:i w:val="false"/>
+                <w:b w:val="false"/>
+                <w:u w:val="none"/>
+                <w:strike w:val="false"/>
+                <w:sz w:val="18"/>
+                <w:szCs w:val="18"/>
+                <w:color w:val="000000"/>
+              </w:rPr>
+              <w:t xml:space="preserve">-0.85</w:t>
+            </w:r>
+          </w:p>
+        </w:tc>
+        <w:tc>
+          <w:tcPr>
+            <w:tcBorders>
+              <w:bottom w:val="none" w:sz="0" w:space="0" w:color="000000"/>
+              <w:top w:val="single" w:sz="12" w:space="0" w:color="666666"/>
+              <w:left w:val="none" w:sz="0" w:space="0" w:color="000000"/>
+              <w:right w:val="none" w:sz="0" w:space="0" w:color="000000"/>
+            </w:tcBorders>
+            <w:shd w:val="clear" w:color="auto" w:fill="FFFFFF"/>
+            <w:tcMar>
+              <w:top w:w="0" w:type="dxa"/>
+              <w:bottom w:w="0" w:type="dxa"/>
+              <w:left w:w="0" w:type="dxa"/>
+              <w:right w:w="0" w:type="dxa"/>
+            </w:tcMar>
+            <w:vAlign w:val="center"/>
+          </w:tcPr>
+          <w:p>
+            <w:pPr>
+              <w:pStyle w:val="Normal"/>
+              <w:jc w:val="center"/>
+              <w:pBdr>
+                <w:bottom w:val="none" w:sz="0" w:space="0" w:color="000000"/>
+                <w:top w:val="none" w:sz="0" w:space="0" w:color="000000"/>
+                <w:left w:val="none" w:sz="0" w:space="0" w:color="000000"/>
+                <w:right w:val="none" w:sz="0" w:space="0" w:color="000000"/>
+              </w:pBdr>
+              <w:spacing w:after="100" w:before="100" w:line="240"/>
+              <w:ind w:left="100" w:right="100" w:firstLine="0" w:firstLineChars="0"/>
+              <w:rPr>
+                <w:rFonts w:ascii="Times New Roman" w:hAnsi="Times New Roman" w:eastAsia="Times New Roman" w:cs="Times New Roman"/>
+                <w:i w:val="false"/>
+                <w:b w:val="false"/>
+                <w:u w:val="none"/>
+                <w:strike w:val="false"/>
+                <w:sz w:val="18"/>
+                <w:szCs w:val="18"/>
+                <w:color w:val="000000"/>
+              </w:rPr>
+            </w:pPr>
+            <w:r>
+              <w:rPr>
+                <w:rFonts w:ascii="Times New Roman" w:hAnsi="Times New Roman" w:eastAsia="Times New Roman" w:cs="Times New Roman"/>
+                <w:i w:val="false"/>
+                <w:b w:val="false"/>
+                <w:u w:val="none"/>
+                <w:strike w:val="false"/>
+                <w:sz w:val="18"/>
+                <w:szCs w:val="18"/>
+                <w:color w:val="000000"/>
+              </w:rPr>
+              <w:t xml:space="preserve">1.38</w:t>
+            </w:r>
+          </w:p>
+        </w:tc>
+        <w:tc>
+          <w:tcPr>
+            <w:tcBorders>
+              <w:bottom w:val="none" w:sz="0" w:space="0" w:color="000000"/>
+              <w:top w:val="single" w:sz="12" w:space="0" w:color="666666"/>
+              <w:left w:val="none" w:sz="0" w:space="0" w:color="000000"/>
+              <w:right w:val="none" w:sz="0" w:space="0" w:color="000000"/>
+            </w:tcBorders>
+            <w:shd w:val="clear" w:color="auto" w:fill="FFFFFF"/>
+            <w:tcMar>
+              <w:top w:w="0" w:type="dxa"/>
+              <w:bottom w:w="0" w:type="dxa"/>
+              <w:left w:w="0" w:type="dxa"/>
+              <w:right w:w="0" w:type="dxa"/>
+            </w:tcMar>
+            <w:vAlign w:val="center"/>
+          </w:tcPr>
+          <w:p>
+            <w:pPr>
+              <w:pStyle w:val="Normal"/>
+              <w:jc w:val="center"/>
+              <w:pBdr>
+                <w:bottom w:val="none" w:sz="0" w:space="0" w:color="000000"/>
+                <w:top w:val="none" w:sz="0" w:space="0" w:color="000000"/>
+                <w:left w:val="none" w:sz="0" w:space="0" w:color="000000"/>
+                <w:right w:val="none" w:sz="0" w:space="0" w:color="000000"/>
+              </w:pBdr>
+              <w:spacing w:after="100" w:before="100" w:line="240"/>
+              <w:ind w:left="100" w:right="100" w:firstLine="0" w:firstLineChars="0"/>
+              <w:rPr>
+                <w:rFonts w:ascii="Times New Roman" w:hAnsi="Times New Roman" w:eastAsia="Times New Roman" w:cs="Times New Roman"/>
+                <w:i w:val="false"/>
+                <w:b w:val="false"/>
+                <w:u w:val="none"/>
+                <w:strike w:val="false"/>
+                <w:sz w:val="18"/>
+                <w:szCs w:val="18"/>
+                <w:color w:val="000000"/>
+              </w:rPr>
+            </w:pPr>
+            <w:r>
+              <w:rPr>
+                <w:rFonts w:ascii="Times New Roman" w:hAnsi="Times New Roman" w:eastAsia="Times New Roman" w:cs="Times New Roman"/>
+                <w:i w:val="false"/>
+                <w:b w:val="false"/>
+                <w:u w:val="none"/>
+                <w:strike w:val="false"/>
+                <w:sz w:val="18"/>
+                <w:szCs w:val="18"/>
+                <w:color w:val="000000"/>
+              </w:rPr>
+              <w:t xml:space="preserve">4.05</w:t>
+            </w:r>
+          </w:p>
+        </w:tc>
+      </w:tr>
+      <w:tr>
+        <w:trPr>
+          <w:trHeight w:val="360" w:hRule="auto"/>
+        </w:trPr>
+        <w:tc>
+          <w:tcPr>
+            <w:tcBorders>
+              <w:bottom w:val="none" w:sz="0" w:space="0" w:color="000000"/>
+              <w:top w:val="none" w:sz="0" w:space="0" w:color="000000"/>
+              <w:left w:val="none" w:sz="0" w:space="0" w:color="000000"/>
+              <w:right w:val="none" w:sz="0" w:space="0" w:color="000000"/>
+            </w:tcBorders>
+            <w:shd w:val="clear" w:color="auto" w:fill="FFFFFF"/>
+            <w:tcMar>
+              <w:top w:w="0" w:type="dxa"/>
+              <w:bottom w:w="0" w:type="dxa"/>
+              <w:left w:w="0" w:type="dxa"/>
+              <w:right w:w="0" w:type="dxa"/>
+            </w:tcMar>
+            <w:vAlign w:val="center"/>
+          </w:tcPr>
+          <w:p>
+            <w:pPr>
+              <w:pStyle w:val="Normal"/>
+              <w:jc w:val="left"/>
+              <w:pBdr>
+                <w:bottom w:val="none" w:sz="0" w:space="0" w:color="000000"/>
+                <w:top w:val="none" w:sz="0" w:space="0" w:color="000000"/>
+                <w:left w:val="none" w:sz="0" w:space="0" w:color="000000"/>
+                <w:right w:val="none" w:sz="0" w:space="0" w:color="000000"/>
+              </w:pBdr>
+              <w:spacing w:after="100" w:before="100" w:line="240"/>
+              <w:ind w:left="100" w:right="100" w:firstLine="0" w:firstLineChars="0"/>
+              <w:rPr>
+                <w:rFonts w:ascii="Times New Roman" w:hAnsi="Times New Roman" w:eastAsia="Times New Roman" w:cs="Times New Roman"/>
+                <w:i w:val="false"/>
+                <w:b w:val="false"/>
+                <w:u w:val="none"/>
+                <w:strike w:val="false"/>
+                <w:sz w:val="18"/>
+                <w:szCs w:val="18"/>
+                <w:color w:val="000000"/>
+              </w:rPr>
+            </w:pPr>
+            <w:r>
+              <w:rPr>
+                <w:rFonts w:ascii="Times New Roman" w:hAnsi="Times New Roman" w:eastAsia="Times New Roman" w:cs="Times New Roman"/>
+                <w:i w:val="false"/>
+                <w:b w:val="false"/>
+                <w:u w:val="none"/>
+                <w:strike w:val="false"/>
+                <w:sz w:val="18"/>
+                <w:szCs w:val="18"/>
+                <w:color w:val="000000"/>
+              </w:rPr>
+              <w:t xml:space="preserve">Spain</w:t>
+            </w:r>
+          </w:p>
+        </w:tc>
+        <w:tc>
+          <w:tcPr>
+            <w:tcBorders>
+              <w:bottom w:val="none" w:sz="0" w:space="0" w:color="000000"/>
+              <w:top w:val="none" w:sz="0" w:space="0" w:color="000000"/>
+              <w:left w:val="none" w:sz="0" w:space="0" w:color="000000"/>
+              <w:right w:val="none" w:sz="0" w:space="0" w:color="000000"/>
+            </w:tcBorders>
+            <w:shd w:val="clear" w:color="auto" w:fill="FFFFFF"/>
+            <w:tcMar>
+              <w:top w:w="0" w:type="dxa"/>
+              <w:bottom w:w="0" w:type="dxa"/>
+              <w:left w:w="0" w:type="dxa"/>
+              <w:right w:w="0" w:type="dxa"/>
+            </w:tcMar>
+            <w:vAlign w:val="center"/>
+          </w:tcPr>
+          <w:p>
+            <w:pPr>
+              <w:pStyle w:val="Normal"/>
+              <w:jc w:val="left"/>
+              <w:pBdr>
+                <w:bottom w:val="none" w:sz="0" w:space="0" w:color="000000"/>
+                <w:top w:val="none" w:sz="0" w:space="0" w:color="000000"/>
+                <w:left w:val="none" w:sz="0" w:space="0" w:color="000000"/>
+                <w:right w:val="none" w:sz="0" w:space="0" w:color="000000"/>
+              </w:pBdr>
+              <w:spacing w:after="100" w:before="100" w:line="240"/>
+              <w:ind w:left="100" w:right="100" w:firstLine="0" w:firstLineChars="0"/>
+              <w:rPr>
+                <w:rFonts w:ascii="Times New Roman" w:hAnsi="Times New Roman" w:eastAsia="Times New Roman" w:cs="Times New Roman"/>
+                <w:i w:val="false"/>
+                <w:b w:val="false"/>
+                <w:u w:val="none"/>
+                <w:strike w:val="false"/>
+                <w:sz w:val="18"/>
+                <w:szCs w:val="18"/>
+                <w:color w:val="000000"/>
+              </w:rPr>
+            </w:pPr>
+            <w:r>
+              <w:rPr>
+                <w:rFonts w:ascii="Times New Roman" w:hAnsi="Times New Roman" w:eastAsia="Times New Roman" w:cs="Times New Roman"/>
+                <w:i w:val="false"/>
+                <w:b w:val="false"/>
+                <w:u w:val="none"/>
+                <w:strike w:val="false"/>
+                <w:sz w:val="18"/>
+                <w:szCs w:val="18"/>
+                <w:color w:val="000000"/>
+              </w:rPr>
+              <w:t xml:space="preserve">1981-2024</w:t>
+            </w:r>
+          </w:p>
+        </w:tc>
+        <w:tc>
+          <w:tcPr>
+            <w:tcBorders>
+              <w:bottom w:val="none" w:sz="0" w:space="0" w:color="000000"/>
+              <w:top w:val="none" w:sz="0" w:space="0" w:color="000000"/>
+              <w:left w:val="none" w:sz="0" w:space="0" w:color="000000"/>
+              <w:right w:val="none" w:sz="0" w:space="0" w:color="000000"/>
+            </w:tcBorders>
+            <w:shd w:val="clear" w:color="auto" w:fill="FFFFFF"/>
+            <w:tcMar>
+              <w:top w:w="0" w:type="dxa"/>
+              <w:bottom w:w="0" w:type="dxa"/>
+              <w:left w:w="0" w:type="dxa"/>
+              <w:right w:w="0" w:type="dxa"/>
+            </w:tcMar>
+            <w:vAlign w:val="center"/>
+          </w:tcPr>
+          <w:p>
+            <w:pPr>
+              <w:pStyle w:val="Normal"/>
+              <w:jc w:val="center"/>
+              <w:pBdr>
+                <w:bottom w:val="none" w:sz="0" w:space="0" w:color="000000"/>
+                <w:top w:val="none" w:sz="0" w:space="0" w:color="000000"/>
+                <w:left w:val="none" w:sz="0" w:space="0" w:color="000000"/>
+                <w:right w:val="none" w:sz="0" w:space="0" w:color="000000"/>
+              </w:pBdr>
+              <w:spacing w:after="100" w:before="100" w:line="240"/>
+              <w:ind w:left="100" w:right="100" w:firstLine="0" w:firstLineChars="0"/>
+              <w:rPr>
+                <w:rFonts w:ascii="Times New Roman" w:hAnsi="Times New Roman" w:eastAsia="Times New Roman" w:cs="Times New Roman"/>
+                <w:i w:val="false"/>
+                <w:b w:val="false"/>
+                <w:u w:val="none"/>
+                <w:strike w:val="false"/>
+                <w:sz w:val="18"/>
+                <w:szCs w:val="18"/>
+                <w:color w:val="000000"/>
+              </w:rPr>
+            </w:pPr>
+            <w:r>
+              <w:rPr>
+                <w:rFonts w:ascii="Times New Roman" w:hAnsi="Times New Roman" w:eastAsia="Times New Roman" w:cs="Times New Roman"/>
+                <w:i w:val="false"/>
+                <w:b w:val="false"/>
+                <w:u w:val="none"/>
+                <w:strike w:val="false"/>
+                <w:sz w:val="18"/>
+                <w:szCs w:val="18"/>
+                <w:color w:val="000000"/>
+              </w:rPr>
+              <w:t xml:space="preserve">0.45</w:t>
+            </w:r>
+          </w:p>
+        </w:tc>
+        <w:tc>
+          <w:tcPr>
+            <w:tcBorders>
+              <w:bottom w:val="none" w:sz="0" w:space="0" w:color="000000"/>
+              <w:top w:val="none" w:sz="0" w:space="0" w:color="000000"/>
+              <w:left w:val="none" w:sz="0" w:space="0" w:color="000000"/>
+              <w:right w:val="none" w:sz="0" w:space="0" w:color="000000"/>
+            </w:tcBorders>
+            <w:shd w:val="clear" w:color="auto" w:fill="FFFFFF"/>
+            <w:tcMar>
+              <w:top w:w="0" w:type="dxa"/>
+              <w:bottom w:w="0" w:type="dxa"/>
+              <w:left w:w="0" w:type="dxa"/>
+              <w:right w:w="0" w:type="dxa"/>
+            </w:tcMar>
+            <w:vAlign w:val="center"/>
+          </w:tcPr>
+          <w:p>
+            <w:pPr>
+              <w:pStyle w:val="Normal"/>
+              <w:jc w:val="center"/>
+              <w:pBdr>
+                <w:bottom w:val="none" w:sz="0" w:space="0" w:color="000000"/>
+                <w:top w:val="none" w:sz="0" w:space="0" w:color="000000"/>
+                <w:left w:val="none" w:sz="0" w:space="0" w:color="000000"/>
+                <w:right w:val="none" w:sz="0" w:space="0" w:color="000000"/>
+              </w:pBdr>
+              <w:spacing w:after="100" w:before="100" w:line="240"/>
+              <w:ind w:left="100" w:right="100" w:firstLine="0" w:firstLineChars="0"/>
+              <w:rPr>
+                <w:rFonts w:ascii="Times New Roman" w:hAnsi="Times New Roman" w:eastAsia="Times New Roman" w:cs="Times New Roman"/>
+                <w:i w:val="false"/>
+                <w:b w:val="false"/>
+                <w:u w:val="none"/>
+                <w:strike w:val="false"/>
+                <w:sz w:val="18"/>
+                <w:szCs w:val="18"/>
+                <w:color w:val="000000"/>
+              </w:rPr>
+            </w:pPr>
+            <w:r>
+              <w:rPr>
+                <w:rFonts w:ascii="Times New Roman" w:hAnsi="Times New Roman" w:eastAsia="Times New Roman" w:cs="Times New Roman"/>
+                <w:i w:val="false"/>
+                <w:b w:val="false"/>
+                <w:u w:val="none"/>
+                <w:strike w:val="false"/>
+                <w:sz w:val="18"/>
+                <w:szCs w:val="18"/>
+                <w:color w:val="000000"/>
+              </w:rPr>
+              <w:t xml:space="preserve">-0.40</w:t>
+            </w:r>
+          </w:p>
+        </w:tc>
+        <w:tc>
+          <w:tcPr>
+            <w:tcBorders>
+              <w:bottom w:val="none" w:sz="0" w:space="0" w:color="000000"/>
+              <w:top w:val="none" w:sz="0" w:space="0" w:color="000000"/>
+              <w:left w:val="none" w:sz="0" w:space="0" w:color="000000"/>
+              <w:right w:val="none" w:sz="0" w:space="0" w:color="000000"/>
+            </w:tcBorders>
+            <w:shd w:val="clear" w:color="auto" w:fill="FFFFFF"/>
+            <w:tcMar>
+              <w:top w:w="0" w:type="dxa"/>
+              <w:bottom w:w="0" w:type="dxa"/>
+              <w:left w:w="0" w:type="dxa"/>
+              <w:right w:w="0" w:type="dxa"/>
+            </w:tcMar>
+            <w:vAlign w:val="center"/>
+          </w:tcPr>
+          <w:p>
+            <w:pPr>
+              <w:pStyle w:val="Normal"/>
+              <w:jc w:val="center"/>
+              <w:pBdr>
+                <w:bottom w:val="none" w:sz="0" w:space="0" w:color="000000"/>
+                <w:top w:val="none" w:sz="0" w:space="0" w:color="000000"/>
+                <w:left w:val="none" w:sz="0" w:space="0" w:color="000000"/>
+                <w:right w:val="none" w:sz="0" w:space="0" w:color="000000"/>
+              </w:pBdr>
+              <w:spacing w:after="100" w:before="100" w:line="240"/>
+              <w:ind w:left="100" w:right="100" w:firstLine="0" w:firstLineChars="0"/>
+              <w:rPr>
+                <w:rFonts w:ascii="Times New Roman" w:hAnsi="Times New Roman" w:eastAsia="Times New Roman" w:cs="Times New Roman"/>
+                <w:i w:val="false"/>
+                <w:b w:val="false"/>
+                <w:u w:val="none"/>
+                <w:strike w:val="false"/>
+                <w:sz w:val="18"/>
+                <w:szCs w:val="18"/>
+                <w:color w:val="000000"/>
+              </w:rPr>
+            </w:pPr>
+            <w:r>
+              <w:rPr>
+                <w:rFonts w:ascii="Times New Roman" w:hAnsi="Times New Roman" w:eastAsia="Times New Roman" w:cs="Times New Roman"/>
+                <w:i w:val="false"/>
+                <w:b w:val="false"/>
+                <w:u w:val="none"/>
+                <w:strike w:val="false"/>
+                <w:sz w:val="18"/>
+                <w:szCs w:val="18"/>
+                <w:color w:val="000000"/>
+              </w:rPr>
+              <w:t xml:space="preserve">0.87</w:t>
+            </w:r>
+          </w:p>
+        </w:tc>
+        <w:tc>
+          <w:tcPr>
+            <w:tcBorders>
+              <w:bottom w:val="none" w:sz="0" w:space="0" w:color="000000"/>
+              <w:top w:val="none" w:sz="0" w:space="0" w:color="000000"/>
+              <w:left w:val="none" w:sz="0" w:space="0" w:color="000000"/>
+              <w:right w:val="none" w:sz="0" w:space="0" w:color="000000"/>
+            </w:tcBorders>
+            <w:shd w:val="clear" w:color="auto" w:fill="FFFFFF"/>
+            <w:tcMar>
+              <w:top w:w="0" w:type="dxa"/>
+              <w:bottom w:w="0" w:type="dxa"/>
+              <w:left w:w="0" w:type="dxa"/>
+              <w:right w:w="0" w:type="dxa"/>
+            </w:tcMar>
+            <w:vAlign w:val="center"/>
+          </w:tcPr>
+          <w:p>
+            <w:pPr>
+              <w:pStyle w:val="Normal"/>
+              <w:jc w:val="center"/>
+              <w:pBdr>
+                <w:bottom w:val="none" w:sz="0" w:space="0" w:color="000000"/>
+                <w:top w:val="none" w:sz="0" w:space="0" w:color="000000"/>
+                <w:left w:val="none" w:sz="0" w:space="0" w:color="000000"/>
+                <w:right w:val="none" w:sz="0" w:space="0" w:color="000000"/>
+              </w:pBdr>
+              <w:spacing w:after="100" w:before="100" w:line="240"/>
+              <w:ind w:left="100" w:right="100" w:firstLine="0" w:firstLineChars="0"/>
+              <w:rPr>
+                <w:rFonts w:ascii="Times New Roman" w:hAnsi="Times New Roman" w:eastAsia="Times New Roman" w:cs="Times New Roman"/>
+                <w:i w:val="false"/>
+                <w:b w:val="false"/>
+                <w:u w:val="none"/>
+                <w:strike w:val="false"/>
+                <w:sz w:val="18"/>
+                <w:szCs w:val="18"/>
+                <w:color w:val="000000"/>
+              </w:rPr>
+            </w:pPr>
+            <w:r>
+              <w:rPr>
+                <w:rFonts w:ascii="Times New Roman" w:hAnsi="Times New Roman" w:eastAsia="Times New Roman" w:cs="Times New Roman"/>
+                <w:i w:val="false"/>
+                <w:b w:val="false"/>
+                <w:u w:val="none"/>
+                <w:strike w:val="false"/>
+                <w:sz w:val="18"/>
+                <w:szCs w:val="18"/>
+                <w:color w:val="000000"/>
+              </w:rPr>
+              <w:t xml:space="preserve">4.30</w:t>
+            </w:r>
+          </w:p>
+        </w:tc>
+      </w:tr>
+      <w:tr>
+        <w:trPr>
+          <w:trHeight w:val="360" w:hRule="auto"/>
+        </w:trPr>
+        <w:tc>
+          <w:tcPr>
+            <w:tcBorders>
+              <w:bottom w:val="none" w:sz="0" w:space="0" w:color="000000"/>
+              <w:top w:val="none" w:sz="0" w:space="0" w:color="000000"/>
+              <w:left w:val="none" w:sz="0" w:space="0" w:color="000000"/>
+              <w:right w:val="none" w:sz="0" w:space="0" w:color="000000"/>
+            </w:tcBorders>
+            <w:shd w:val="clear" w:color="auto" w:fill="FFFFFF"/>
+            <w:tcMar>
+              <w:top w:w="0" w:type="dxa"/>
+              <w:bottom w:w="0" w:type="dxa"/>
+              <w:left w:w="0" w:type="dxa"/>
+              <w:right w:w="0" w:type="dxa"/>
+            </w:tcMar>
+            <w:vAlign w:val="center"/>
+          </w:tcPr>
+          <w:p>
+            <w:pPr>
+              <w:pStyle w:val="Normal"/>
+              <w:jc w:val="left"/>
+              <w:pBdr>
+                <w:bottom w:val="none" w:sz="0" w:space="0" w:color="000000"/>
+                <w:top w:val="none" w:sz="0" w:space="0" w:color="000000"/>
+                <w:left w:val="none" w:sz="0" w:space="0" w:color="000000"/>
+                <w:right w:val="none" w:sz="0" w:space="0" w:color="000000"/>
+              </w:pBdr>
+              <w:spacing w:after="100" w:before="100" w:line="240"/>
+              <w:ind w:left="100" w:right="100" w:firstLine="0" w:firstLineChars="0"/>
+              <w:rPr>
+                <w:rFonts w:ascii="Times New Roman" w:hAnsi="Times New Roman" w:eastAsia="Times New Roman" w:cs="Times New Roman"/>
+                <w:i w:val="false"/>
+                <w:b w:val="false"/>
+                <w:u w:val="none"/>
+                <w:strike w:val="false"/>
+                <w:sz w:val="18"/>
+                <w:szCs w:val="18"/>
+                <w:color w:val="000000"/>
+              </w:rPr>
+            </w:pPr>
+            <w:r>
+              <w:rPr>
+                <w:rFonts w:ascii="Times New Roman" w:hAnsi="Times New Roman" w:eastAsia="Times New Roman" w:cs="Times New Roman"/>
+                <w:i w:val="false"/>
+                <w:b w:val="false"/>
+                <w:u w:val="none"/>
+                <w:strike w:val="false"/>
+                <w:sz w:val="18"/>
+                <w:szCs w:val="18"/>
+                <w:color w:val="000000"/>
+              </w:rPr>
+              <w:t xml:space="preserve">Italy</w:t>
+            </w:r>
+          </w:p>
+        </w:tc>
+        <w:tc>
+          <w:tcPr>
+            <w:tcBorders>
+              <w:bottom w:val="none" w:sz="0" w:space="0" w:color="000000"/>
+              <w:top w:val="none" w:sz="0" w:space="0" w:color="000000"/>
+              <w:left w:val="none" w:sz="0" w:space="0" w:color="000000"/>
+              <w:right w:val="none" w:sz="0" w:space="0" w:color="000000"/>
+            </w:tcBorders>
+            <w:shd w:val="clear" w:color="auto" w:fill="FFFFFF"/>
+            <w:tcMar>
+              <w:top w:w="0" w:type="dxa"/>
+              <w:bottom w:w="0" w:type="dxa"/>
+              <w:left w:w="0" w:type="dxa"/>
+              <w:right w:w="0" w:type="dxa"/>
+            </w:tcMar>
+            <w:vAlign w:val="center"/>
+          </w:tcPr>
+          <w:p>
+            <w:pPr>
+              <w:pStyle w:val="Normal"/>
+              <w:jc w:val="left"/>
+              <w:pBdr>
+                <w:bottom w:val="none" w:sz="0" w:space="0" w:color="000000"/>
+                <w:top w:val="none" w:sz="0" w:space="0" w:color="000000"/>
+                <w:left w:val="none" w:sz="0" w:space="0" w:color="000000"/>
+                <w:right w:val="none" w:sz="0" w:space="0" w:color="000000"/>
+              </w:pBdr>
+              <w:spacing w:after="100" w:before="100" w:line="240"/>
+              <w:ind w:left="100" w:right="100" w:firstLine="0" w:firstLineChars="0"/>
+              <w:rPr>
+                <w:rFonts w:ascii="Times New Roman" w:hAnsi="Times New Roman" w:eastAsia="Times New Roman" w:cs="Times New Roman"/>
+                <w:i w:val="false"/>
+                <w:b w:val="false"/>
+                <w:u w:val="none"/>
+                <w:strike w:val="false"/>
+                <w:sz w:val="18"/>
+                <w:szCs w:val="18"/>
+                <w:color w:val="000000"/>
+              </w:rPr>
+            </w:pPr>
+            <w:r>
+              <w:rPr>
+                <w:rFonts w:ascii="Times New Roman" w:hAnsi="Times New Roman" w:eastAsia="Times New Roman" w:cs="Times New Roman"/>
+                <w:i w:val="false"/>
+                <w:b w:val="false"/>
+                <w:u w:val="none"/>
+                <w:strike w:val="false"/>
+                <w:sz w:val="18"/>
+                <w:szCs w:val="18"/>
+                <w:color w:val="000000"/>
+              </w:rPr>
+              <w:t xml:space="preserve">1981-2024</w:t>
+            </w:r>
+          </w:p>
+        </w:tc>
+        <w:tc>
+          <w:tcPr>
+            <w:tcBorders>
+              <w:bottom w:val="none" w:sz="0" w:space="0" w:color="000000"/>
+              <w:top w:val="none" w:sz="0" w:space="0" w:color="000000"/>
+              <w:left w:val="none" w:sz="0" w:space="0" w:color="000000"/>
+              <w:right w:val="none" w:sz="0" w:space="0" w:color="000000"/>
+            </w:tcBorders>
+            <w:shd w:val="clear" w:color="auto" w:fill="FFFFFF"/>
+            <w:tcMar>
+              <w:top w:w="0" w:type="dxa"/>
+              <w:bottom w:w="0" w:type="dxa"/>
+              <w:left w:w="0" w:type="dxa"/>
+              <w:right w:w="0" w:type="dxa"/>
+            </w:tcMar>
+            <w:vAlign w:val="center"/>
+          </w:tcPr>
+          <w:p>
+            <w:pPr>
+              <w:pStyle w:val="Normal"/>
+              <w:jc w:val="center"/>
+              <w:pBdr>
+                <w:bottom w:val="none" w:sz="0" w:space="0" w:color="000000"/>
+                <w:top w:val="none" w:sz="0" w:space="0" w:color="000000"/>
+                <w:left w:val="none" w:sz="0" w:space="0" w:color="000000"/>
+                <w:right w:val="none" w:sz="0" w:space="0" w:color="000000"/>
+              </w:pBdr>
+              <w:spacing w:after="100" w:before="100" w:line="240"/>
+              <w:ind w:left="100" w:right="100" w:firstLine="0" w:firstLineChars="0"/>
+              <w:rPr>
+                <w:rFonts w:ascii="Times New Roman" w:hAnsi="Times New Roman" w:eastAsia="Times New Roman" w:cs="Times New Roman"/>
+                <w:i w:val="false"/>
+                <w:b w:val="false"/>
+                <w:u w:val="none"/>
+                <w:strike w:val="false"/>
+                <w:sz w:val="18"/>
+                <w:szCs w:val="18"/>
+                <w:color w:val="000000"/>
+              </w:rPr>
+            </w:pPr>
+            <w:r>
+              <w:rPr>
+                <w:rFonts w:ascii="Times New Roman" w:hAnsi="Times New Roman" w:eastAsia="Times New Roman" w:cs="Times New Roman"/>
+                <w:i w:val="false"/>
+                <w:b w:val="false"/>
+                <w:u w:val="none"/>
+                <w:strike w:val="false"/>
+                <w:sz w:val="18"/>
+                <w:szCs w:val="18"/>
+                <w:color w:val="000000"/>
+              </w:rPr>
+              <w:t xml:space="preserve">0.15</w:t>
+            </w:r>
+          </w:p>
+        </w:tc>
+        <w:tc>
+          <w:tcPr>
+            <w:tcBorders>
+              <w:bottom w:val="none" w:sz="0" w:space="0" w:color="000000"/>
+              <w:top w:val="none" w:sz="0" w:space="0" w:color="000000"/>
+              <w:left w:val="none" w:sz="0" w:space="0" w:color="000000"/>
+              <w:right w:val="none" w:sz="0" w:space="0" w:color="000000"/>
+            </w:tcBorders>
+            <w:shd w:val="clear" w:color="auto" w:fill="FFFFFF"/>
+            <w:tcMar>
+              <w:top w:w="0" w:type="dxa"/>
+              <w:bottom w:w="0" w:type="dxa"/>
+              <w:left w:w="0" w:type="dxa"/>
+              <w:right w:w="0" w:type="dxa"/>
+            </w:tcMar>
+            <w:vAlign w:val="center"/>
+          </w:tcPr>
+          <w:p>
+            <w:pPr>
+              <w:pStyle w:val="Normal"/>
+              <w:jc w:val="center"/>
+              <w:pBdr>
+                <w:bottom w:val="none" w:sz="0" w:space="0" w:color="000000"/>
+                <w:top w:val="none" w:sz="0" w:space="0" w:color="000000"/>
+                <w:left w:val="none" w:sz="0" w:space="0" w:color="000000"/>
+                <w:right w:val="none" w:sz="0" w:space="0" w:color="000000"/>
+              </w:pBdr>
+              <w:spacing w:after="100" w:before="100" w:line="240"/>
+              <w:ind w:left="100" w:right="100" w:firstLine="0" w:firstLineChars="0"/>
+              <w:rPr>
+                <w:rFonts w:ascii="Times New Roman" w:hAnsi="Times New Roman" w:eastAsia="Times New Roman" w:cs="Times New Roman"/>
+                <w:i w:val="false"/>
+                <w:b w:val="false"/>
+                <w:u w:val="none"/>
+                <w:strike w:val="false"/>
+                <w:sz w:val="18"/>
+                <w:szCs w:val="18"/>
+                <w:color w:val="000000"/>
+              </w:rPr>
+            </w:pPr>
+            <w:r>
+              <w:rPr>
+                <w:rFonts w:ascii="Times New Roman" w:hAnsi="Times New Roman" w:eastAsia="Times New Roman" w:cs="Times New Roman"/>
+                <w:i w:val="false"/>
+                <w:b w:val="false"/>
+                <w:u w:val="none"/>
+                <w:strike w:val="false"/>
+                <w:sz w:val="18"/>
+                <w:szCs w:val="18"/>
+                <w:color w:val="000000"/>
+              </w:rPr>
+              <w:t xml:space="preserve">-0.77</w:t>
+            </w:r>
+          </w:p>
+        </w:tc>
+        <w:tc>
+          <w:tcPr>
+            <w:tcBorders>
+              <w:bottom w:val="none" w:sz="0" w:space="0" w:color="000000"/>
+              <w:top w:val="none" w:sz="0" w:space="0" w:color="000000"/>
+              <w:left w:val="none" w:sz="0" w:space="0" w:color="000000"/>
+              <w:right w:val="none" w:sz="0" w:space="0" w:color="000000"/>
+            </w:tcBorders>
+            <w:shd w:val="clear" w:color="auto" w:fill="FFFFFF"/>
+            <w:tcMar>
+              <w:top w:w="0" w:type="dxa"/>
+              <w:bottom w:w="0" w:type="dxa"/>
+              <w:left w:w="0" w:type="dxa"/>
+              <w:right w:w="0" w:type="dxa"/>
+            </w:tcMar>
+            <w:vAlign w:val="center"/>
+          </w:tcPr>
+          <w:p>
+            <w:pPr>
+              <w:pStyle w:val="Normal"/>
+              <w:jc w:val="center"/>
+              <w:pBdr>
+                <w:bottom w:val="none" w:sz="0" w:space="0" w:color="000000"/>
+                <w:top w:val="none" w:sz="0" w:space="0" w:color="000000"/>
+                <w:left w:val="none" w:sz="0" w:space="0" w:color="000000"/>
+                <w:right w:val="none" w:sz="0" w:space="0" w:color="000000"/>
+              </w:pBdr>
+              <w:spacing w:after="100" w:before="100" w:line="240"/>
+              <w:ind w:left="100" w:right="100" w:firstLine="0" w:firstLineChars="0"/>
+              <w:rPr>
+                <w:rFonts w:ascii="Times New Roman" w:hAnsi="Times New Roman" w:eastAsia="Times New Roman" w:cs="Times New Roman"/>
+                <w:i w:val="false"/>
+                <w:b w:val="false"/>
+                <w:u w:val="none"/>
+                <w:strike w:val="false"/>
+                <w:sz w:val="18"/>
+                <w:szCs w:val="18"/>
+                <w:color w:val="000000"/>
+              </w:rPr>
+            </w:pPr>
+            <w:r>
+              <w:rPr>
+                <w:rFonts w:ascii="Times New Roman" w:hAnsi="Times New Roman" w:eastAsia="Times New Roman" w:cs="Times New Roman"/>
+                <w:i w:val="false"/>
+                <w:b w:val="false"/>
+                <w:u w:val="none"/>
+                <w:strike w:val="false"/>
+                <w:sz w:val="18"/>
+                <w:szCs w:val="18"/>
+                <w:color w:val="000000"/>
+              </w:rPr>
+              <w:t xml:space="preserve">0.93</w:t>
+            </w:r>
+          </w:p>
+        </w:tc>
+        <w:tc>
+          <w:tcPr>
+            <w:tcBorders>
+              <w:bottom w:val="none" w:sz="0" w:space="0" w:color="000000"/>
+              <w:top w:val="none" w:sz="0" w:space="0" w:color="000000"/>
+              <w:left w:val="none" w:sz="0" w:space="0" w:color="000000"/>
+              <w:right w:val="none" w:sz="0" w:space="0" w:color="000000"/>
+            </w:tcBorders>
+            <w:shd w:val="clear" w:color="auto" w:fill="FFFFFF"/>
+            <w:tcMar>
+              <w:top w:w="0" w:type="dxa"/>
+              <w:bottom w:w="0" w:type="dxa"/>
+              <w:left w:w="0" w:type="dxa"/>
+              <w:right w:w="0" w:type="dxa"/>
+            </w:tcMar>
+            <w:vAlign w:val="center"/>
+          </w:tcPr>
+          <w:p>
+            <w:pPr>
+              <w:pStyle w:val="Normal"/>
+              <w:jc w:val="center"/>
+              <w:pBdr>
+                <w:bottom w:val="none" w:sz="0" w:space="0" w:color="000000"/>
+                <w:top w:val="none" w:sz="0" w:space="0" w:color="000000"/>
+                <w:left w:val="none" w:sz="0" w:space="0" w:color="000000"/>
+                <w:right w:val="none" w:sz="0" w:space="0" w:color="000000"/>
+              </w:pBdr>
+              <w:spacing w:after="100" w:before="100" w:line="240"/>
+              <w:ind w:left="100" w:right="100" w:firstLine="0" w:firstLineChars="0"/>
+              <w:rPr>
+                <w:rFonts w:ascii="Times New Roman" w:hAnsi="Times New Roman" w:eastAsia="Times New Roman" w:cs="Times New Roman"/>
+                <w:i w:val="false"/>
+                <w:b w:val="false"/>
+                <w:u w:val="none"/>
+                <w:strike w:val="false"/>
+                <w:sz w:val="18"/>
+                <w:szCs w:val="18"/>
+                <w:color w:val="000000"/>
+              </w:rPr>
+            </w:pPr>
+            <w:r>
+              <w:rPr>
+                <w:rFonts w:ascii="Times New Roman" w:hAnsi="Times New Roman" w:eastAsia="Times New Roman" w:cs="Times New Roman"/>
+                <w:i w:val="false"/>
+                <w:b w:val="false"/>
+                <w:u w:val="none"/>
+                <w:strike w:val="false"/>
+                <w:sz w:val="18"/>
+                <w:szCs w:val="18"/>
+                <w:color w:val="000000"/>
+              </w:rPr>
+              <w:t xml:space="preserve">2.85</w:t>
+            </w:r>
+          </w:p>
+        </w:tc>
+      </w:tr>
+      <w:tr>
+        <w:trPr>
+          <w:trHeight w:val="360" w:hRule="auto"/>
+        </w:trPr>
+        <w:tc>
+          <w:tcPr>
+            <w:tcBorders>
+              <w:bottom w:val="none" w:sz="0" w:space="0" w:color="000000"/>
+              <w:top w:val="none" w:sz="0" w:space="0" w:color="000000"/>
+              <w:left w:val="none" w:sz="0" w:space="0" w:color="000000"/>
+              <w:right w:val="none" w:sz="0" w:space="0" w:color="000000"/>
+            </w:tcBorders>
+            <w:shd w:val="clear" w:color="auto" w:fill="FFFFFF"/>
+            <w:tcMar>
+              <w:top w:w="0" w:type="dxa"/>
+              <w:bottom w:w="0" w:type="dxa"/>
+              <w:left w:w="0" w:type="dxa"/>
+              <w:right w:w="0" w:type="dxa"/>
+            </w:tcMar>
+            <w:vAlign w:val="center"/>
+          </w:tcPr>
+          <w:p>
+            <w:pPr>
+              <w:pStyle w:val="Normal"/>
+              <w:jc w:val="left"/>
+              <w:pBdr>
+                <w:bottom w:val="none" w:sz="0" w:space="0" w:color="000000"/>
+                <w:top w:val="none" w:sz="0" w:space="0" w:color="000000"/>
+                <w:left w:val="none" w:sz="0" w:space="0" w:color="000000"/>
+                <w:right w:val="none" w:sz="0" w:space="0" w:color="000000"/>
+              </w:pBdr>
+              <w:spacing w:after="100" w:before="100" w:line="240"/>
+              <w:ind w:left="100" w:right="100" w:firstLine="0" w:firstLineChars="0"/>
+              <w:rPr>
+                <w:rFonts w:ascii="Times New Roman" w:hAnsi="Times New Roman" w:eastAsia="Times New Roman" w:cs="Times New Roman"/>
+                <w:i w:val="false"/>
+                <w:b w:val="true"/>
+                <w:u w:val="none"/>
+                <w:strike w:val="false"/>
+                <w:sz w:val="18"/>
+                <w:szCs w:val="18"/>
+                <w:color w:val="000000"/>
+              </w:rPr>
+            </w:pPr>
+            <w:r>
+              <w:rPr>
+                <w:rFonts w:ascii="Times New Roman" w:hAnsi="Times New Roman" w:eastAsia="Times New Roman" w:cs="Times New Roman"/>
+                <w:i w:val="false"/>
+                <w:b w:val="true"/>
+                <w:u w:val="none"/>
+                <w:strike w:val="false"/>
+                <w:sz w:val="18"/>
+                <w:szCs w:val="18"/>
+                <w:color w:val="000000"/>
+              </w:rPr>
+              <w:t xml:space="preserve">GIS</w:t>
+            </w:r>
+          </w:p>
+        </w:tc>
+        <w:tc>
+          <w:tcPr>
+            <w:tcBorders>
+              <w:bottom w:val="none" w:sz="0" w:space="0" w:color="000000"/>
+              <w:top w:val="none" w:sz="0" w:space="0" w:color="000000"/>
+              <w:left w:val="none" w:sz="0" w:space="0" w:color="000000"/>
+              <w:right w:val="none" w:sz="0" w:space="0" w:color="000000"/>
+            </w:tcBorders>
+            <w:shd w:val="clear" w:color="auto" w:fill="FFFFFF"/>
+            <w:tcMar>
+              <w:top w:w="0" w:type="dxa"/>
+              <w:bottom w:w="0" w:type="dxa"/>
+              <w:left w:w="0" w:type="dxa"/>
+              <w:right w:w="0" w:type="dxa"/>
+            </w:tcMar>
+            <w:vAlign w:val="center"/>
+          </w:tcPr>
+          <w:p>
+            <w:pPr>
+              <w:pStyle w:val="Normal"/>
+              <w:jc w:val="left"/>
+              <w:pBdr>
+                <w:bottom w:val="none" w:sz="0" w:space="0" w:color="000000"/>
+                <w:top w:val="none" w:sz="0" w:space="0" w:color="000000"/>
+                <w:left w:val="none" w:sz="0" w:space="0" w:color="000000"/>
+                <w:right w:val="none" w:sz="0" w:space="0" w:color="000000"/>
+              </w:pBdr>
+              <w:spacing w:after="100" w:before="100" w:line="240"/>
+              <w:ind w:left="100" w:right="100" w:firstLine="0" w:firstLineChars="0"/>
+              <w:rPr>
+                <w:rFonts w:ascii="Times New Roman" w:hAnsi="Times New Roman" w:eastAsia="Times New Roman" w:cs="Times New Roman"/>
+                <w:i w:val="false"/>
+                <w:b w:val="true"/>
+                <w:u w:val="none"/>
+                <w:strike w:val="false"/>
+                <w:sz w:val="18"/>
+                <w:szCs w:val="18"/>
+                <w:color w:val="000000"/>
+              </w:rPr>
+            </w:pPr>
+            <w:r>
+              <w:rPr>
+                <w:rFonts w:ascii="Times New Roman" w:hAnsi="Times New Roman" w:eastAsia="Times New Roman" w:cs="Times New Roman"/>
+                <w:i w:val="false"/>
+                <w:b w:val="true"/>
+                <w:u w:val="none"/>
+                <w:strike w:val="false"/>
+                <w:sz w:val="18"/>
+                <w:szCs w:val="18"/>
+                <w:color w:val="000000"/>
+              </w:rPr>
+              <w:t xml:space="preserve"/>
+            </w:r>
+          </w:p>
+        </w:tc>
+        <w:tc>
+          <w:tcPr>
+            <w:tcBorders>
+              <w:bottom w:val="none" w:sz="0" w:space="0" w:color="000000"/>
+              <w:top w:val="none" w:sz="0" w:space="0" w:color="000000"/>
+              <w:left w:val="none" w:sz="0" w:space="0" w:color="000000"/>
+              <w:right w:val="none" w:sz="0" w:space="0" w:color="000000"/>
+            </w:tcBorders>
+            <w:shd w:val="clear" w:color="auto" w:fill="FFFFFF"/>
+            <w:tcMar>
+              <w:top w:w="0" w:type="dxa"/>
+              <w:bottom w:w="0" w:type="dxa"/>
+              <w:left w:w="0" w:type="dxa"/>
+              <w:right w:w="0" w:type="dxa"/>
+            </w:tcMar>
+            <w:vAlign w:val="center"/>
+          </w:tcPr>
+          <w:p>
+            <w:pPr>
+              <w:pStyle w:val="Normal"/>
+              <w:jc w:val="center"/>
+              <w:pBdr>
+                <w:bottom w:val="none" w:sz="0" w:space="0" w:color="000000"/>
+                <w:top w:val="none" w:sz="0" w:space="0" w:color="000000"/>
+                <w:left w:val="none" w:sz="0" w:space="0" w:color="000000"/>
+                <w:right w:val="none" w:sz="0" w:space="0" w:color="000000"/>
+              </w:pBdr>
+              <w:spacing w:after="100" w:before="100" w:line="240"/>
+              <w:ind w:left="100" w:right="100" w:firstLine="0" w:firstLineChars="0"/>
+              <w:rPr>
+                <w:rFonts w:ascii="Times New Roman" w:hAnsi="Times New Roman" w:eastAsia="Times New Roman" w:cs="Times New Roman"/>
+                <w:i w:val="false"/>
+                <w:b w:val="true"/>
+                <w:u w:val="none"/>
+                <w:strike w:val="false"/>
+                <w:sz w:val="18"/>
+                <w:szCs w:val="18"/>
+                <w:color w:val="000000"/>
+              </w:rPr>
+            </w:pPr>
+            <w:r>
+              <w:rPr>
+                <w:rFonts w:ascii="Times New Roman" w:hAnsi="Times New Roman" w:eastAsia="Times New Roman" w:cs="Times New Roman"/>
+                <w:i w:val="false"/>
+                <w:b w:val="true"/>
+                <w:u w:val="none"/>
+                <w:strike w:val="false"/>
+                <w:sz w:val="18"/>
+                <w:szCs w:val="18"/>
+                <w:color w:val="000000"/>
+              </w:rPr>
+              <w:t xml:space="preserve">0.37</w:t>
+            </w:r>
+          </w:p>
+        </w:tc>
+        <w:tc>
+          <w:tcPr>
+            <w:tcBorders>
+              <w:bottom w:val="none" w:sz="0" w:space="0" w:color="000000"/>
+              <w:top w:val="none" w:sz="0" w:space="0" w:color="000000"/>
+              <w:left w:val="none" w:sz="0" w:space="0" w:color="000000"/>
+              <w:right w:val="none" w:sz="0" w:space="0" w:color="000000"/>
+            </w:tcBorders>
+            <w:shd w:val="clear" w:color="auto" w:fill="FFFFFF"/>
+            <w:tcMar>
+              <w:top w:w="0" w:type="dxa"/>
+              <w:bottom w:w="0" w:type="dxa"/>
+              <w:left w:w="0" w:type="dxa"/>
+              <w:right w:w="0" w:type="dxa"/>
+            </w:tcMar>
+            <w:vAlign w:val="center"/>
+          </w:tcPr>
+          <w:p>
+            <w:pPr>
+              <w:pStyle w:val="Normal"/>
+              <w:jc w:val="center"/>
+              <w:pBdr>
+                <w:bottom w:val="none" w:sz="0" w:space="0" w:color="000000"/>
+                <w:top w:val="none" w:sz="0" w:space="0" w:color="000000"/>
+                <w:left w:val="none" w:sz="0" w:space="0" w:color="000000"/>
+                <w:right w:val="none" w:sz="0" w:space="0" w:color="000000"/>
+              </w:pBdr>
+              <w:spacing w:after="100" w:before="100" w:line="240"/>
+              <w:ind w:left="100" w:right="100" w:firstLine="0" w:firstLineChars="0"/>
+              <w:rPr>
+                <w:rFonts w:ascii="Times New Roman" w:hAnsi="Times New Roman" w:eastAsia="Times New Roman" w:cs="Times New Roman"/>
+                <w:i w:val="false"/>
+                <w:b w:val="true"/>
+                <w:u w:val="none"/>
+                <w:strike w:val="false"/>
+                <w:sz w:val="18"/>
+                <w:szCs w:val="18"/>
+                <w:color w:val="000000"/>
+              </w:rPr>
+            </w:pPr>
+            <w:r>
+              <w:rPr>
+                <w:rFonts w:ascii="Times New Roman" w:hAnsi="Times New Roman" w:eastAsia="Times New Roman" w:cs="Times New Roman"/>
+                <w:i w:val="false"/>
+                <w:b w:val="true"/>
+                <w:u w:val="none"/>
+                <w:strike w:val="false"/>
+                <w:sz w:val="18"/>
+                <w:szCs w:val="18"/>
+                <w:color w:val="000000"/>
+              </w:rPr>
+              <w:t xml:space="preserve">-0.67</w:t>
+            </w:r>
+          </w:p>
+        </w:tc>
+        <w:tc>
+          <w:tcPr>
+            <w:tcBorders>
+              <w:bottom w:val="none" w:sz="0" w:space="0" w:color="000000"/>
+              <w:top w:val="none" w:sz="0" w:space="0" w:color="000000"/>
+              <w:left w:val="none" w:sz="0" w:space="0" w:color="000000"/>
+              <w:right w:val="none" w:sz="0" w:space="0" w:color="000000"/>
+            </w:tcBorders>
+            <w:shd w:val="clear" w:color="auto" w:fill="FFFFFF"/>
+            <w:tcMar>
+              <w:top w:w="0" w:type="dxa"/>
+              <w:bottom w:w="0" w:type="dxa"/>
+              <w:left w:w="0" w:type="dxa"/>
+              <w:right w:w="0" w:type="dxa"/>
+            </w:tcMar>
+            <w:vAlign w:val="center"/>
+          </w:tcPr>
+          <w:p>
+            <w:pPr>
+              <w:pStyle w:val="Normal"/>
+              <w:jc w:val="center"/>
+              <w:pBdr>
+                <w:bottom w:val="none" w:sz="0" w:space="0" w:color="000000"/>
+                <w:top w:val="none" w:sz="0" w:space="0" w:color="000000"/>
+                <w:left w:val="none" w:sz="0" w:space="0" w:color="000000"/>
+                <w:right w:val="none" w:sz="0" w:space="0" w:color="000000"/>
+              </w:pBdr>
+              <w:spacing w:after="100" w:before="100" w:line="240"/>
+              <w:ind w:left="100" w:right="100" w:firstLine="0" w:firstLineChars="0"/>
+              <w:rPr>
+                <w:rFonts w:ascii="Times New Roman" w:hAnsi="Times New Roman" w:eastAsia="Times New Roman" w:cs="Times New Roman"/>
+                <w:i w:val="false"/>
+                <w:b w:val="true"/>
+                <w:u w:val="none"/>
+                <w:strike w:val="false"/>
+                <w:sz w:val="18"/>
+                <w:szCs w:val="18"/>
+                <w:color w:val="000000"/>
+              </w:rPr>
+            </w:pPr>
+            <w:r>
+              <w:rPr>
+                <w:rFonts w:ascii="Times New Roman" w:hAnsi="Times New Roman" w:eastAsia="Times New Roman" w:cs="Times New Roman"/>
+                <w:i w:val="false"/>
+                <w:b w:val="true"/>
+                <w:u w:val="none"/>
+                <w:strike w:val="false"/>
+                <w:sz w:val="18"/>
+                <w:szCs w:val="18"/>
+                <w:color w:val="000000"/>
+              </w:rPr>
+              <w:t xml:space="preserve">1.06</w:t>
+            </w:r>
+          </w:p>
+        </w:tc>
+        <w:tc>
+          <w:tcPr>
+            <w:tcBorders>
+              <w:bottom w:val="none" w:sz="0" w:space="0" w:color="000000"/>
+              <w:top w:val="none" w:sz="0" w:space="0" w:color="000000"/>
+              <w:left w:val="none" w:sz="0" w:space="0" w:color="000000"/>
+              <w:right w:val="none" w:sz="0" w:space="0" w:color="000000"/>
+            </w:tcBorders>
+            <w:shd w:val="clear" w:color="auto" w:fill="FFFFFF"/>
+            <w:tcMar>
+              <w:top w:w="0" w:type="dxa"/>
+              <w:bottom w:w="0" w:type="dxa"/>
+              <w:left w:w="0" w:type="dxa"/>
+              <w:right w:w="0" w:type="dxa"/>
+            </w:tcMar>
+            <w:vAlign w:val="center"/>
+          </w:tcPr>
+          <w:p>
+            <w:pPr>
+              <w:pStyle w:val="Normal"/>
+              <w:jc w:val="center"/>
+              <w:pBdr>
+                <w:bottom w:val="none" w:sz="0" w:space="0" w:color="000000"/>
+                <w:top w:val="none" w:sz="0" w:space="0" w:color="000000"/>
+                <w:left w:val="none" w:sz="0" w:space="0" w:color="000000"/>
+                <w:right w:val="none" w:sz="0" w:space="0" w:color="000000"/>
+              </w:pBdr>
+              <w:spacing w:after="100" w:before="100" w:line="240"/>
+              <w:ind w:left="100" w:right="100" w:firstLine="0" w:firstLineChars="0"/>
+              <w:rPr>
+                <w:rFonts w:ascii="Times New Roman" w:hAnsi="Times New Roman" w:eastAsia="Times New Roman" w:cs="Times New Roman"/>
+                <w:i w:val="false"/>
+                <w:b w:val="true"/>
+                <w:u w:val="none"/>
+                <w:strike w:val="false"/>
+                <w:sz w:val="18"/>
+                <w:szCs w:val="18"/>
+                <w:color w:val="000000"/>
+              </w:rPr>
+            </w:pPr>
+            <w:r>
+              <w:rPr>
+                <w:rFonts w:ascii="Times New Roman" w:hAnsi="Times New Roman" w:eastAsia="Times New Roman" w:cs="Times New Roman"/>
+                <w:i w:val="false"/>
+                <w:b w:val="true"/>
+                <w:u w:val="none"/>
+                <w:strike w:val="false"/>
+                <w:sz w:val="18"/>
+                <w:szCs w:val="18"/>
+                <w:color w:val="000000"/>
+              </w:rPr>
+              <w:t xml:space="preserve">3.73</w:t>
+            </w:r>
+          </w:p>
+        </w:tc>
+      </w:tr>
+      <w:tr>
+        <w:trPr>
+          <w:trHeight w:val="360" w:hRule="auto"/>
+        </w:trPr>
+        <w:tc>
+          <w:tcPr>
+            <w:tcBorders>
+              <w:bottom w:val="none" w:sz="0" w:space="0" w:color="000000"/>
+              <w:top w:val="none" w:sz="0" w:space="0" w:color="000000"/>
+              <w:left w:val="none" w:sz="0" w:space="0" w:color="000000"/>
+              <w:right w:val="none" w:sz="0" w:space="0" w:color="000000"/>
+            </w:tcBorders>
+            <w:shd w:val="clear" w:color="auto" w:fill="FFFFFF"/>
+            <w:tcMar>
+              <w:top w:w="0" w:type="dxa"/>
+              <w:bottom w:w="0" w:type="dxa"/>
+              <w:left w:w="0" w:type="dxa"/>
+              <w:right w:w="0" w:type="dxa"/>
+            </w:tcMar>
+            <w:vAlign w:val="center"/>
+          </w:tcPr>
+          <w:p>
+            <w:pPr>
+              <w:pStyle w:val="Normal"/>
+              <w:jc w:val="left"/>
+              <w:pBdr>
+                <w:bottom w:val="none" w:sz="0" w:space="0" w:color="000000"/>
+                <w:top w:val="none" w:sz="0" w:space="0" w:color="000000"/>
+                <w:left w:val="none" w:sz="0" w:space="0" w:color="000000"/>
+                <w:right w:val="none" w:sz="0" w:space="0" w:color="000000"/>
+              </w:pBdr>
+              <w:spacing w:after="100" w:before="100" w:line="240"/>
+              <w:ind w:left="100" w:right="100" w:firstLine="0" w:firstLineChars="0"/>
+              <w:rPr>
+                <w:rFonts w:ascii="Times New Roman" w:hAnsi="Times New Roman" w:eastAsia="Times New Roman" w:cs="Times New Roman"/>
+                <w:i w:val="false"/>
+                <w:b w:val="false"/>
+                <w:u w:val="none"/>
+                <w:strike w:val="false"/>
+                <w:sz w:val="18"/>
+                <w:szCs w:val="18"/>
+                <w:color w:val="000000"/>
+              </w:rPr>
+            </w:pPr>
+            <w:r>
+              <w:rPr>
+                <w:rFonts w:ascii="Times New Roman" w:hAnsi="Times New Roman" w:eastAsia="Times New Roman" w:cs="Times New Roman"/>
+                <w:i w:val="false"/>
+                <w:b w:val="false"/>
+                <w:u w:val="none"/>
+                <w:strike w:val="false"/>
+                <w:sz w:val="18"/>
+                <w:szCs w:val="18"/>
+                <w:color w:val="000000"/>
+              </w:rPr>
+              <w:t xml:space="preserve">France</w:t>
+            </w:r>
+          </w:p>
+        </w:tc>
+        <w:tc>
+          <w:tcPr>
+            <w:tcBorders>
+              <w:bottom w:val="none" w:sz="0" w:space="0" w:color="000000"/>
+              <w:top w:val="none" w:sz="0" w:space="0" w:color="000000"/>
+              <w:left w:val="none" w:sz="0" w:space="0" w:color="000000"/>
+              <w:right w:val="none" w:sz="0" w:space="0" w:color="000000"/>
+            </w:tcBorders>
+            <w:shd w:val="clear" w:color="auto" w:fill="FFFFFF"/>
+            <w:tcMar>
+              <w:top w:w="0" w:type="dxa"/>
+              <w:bottom w:w="0" w:type="dxa"/>
+              <w:left w:w="0" w:type="dxa"/>
+              <w:right w:w="0" w:type="dxa"/>
+            </w:tcMar>
+            <w:vAlign w:val="center"/>
+          </w:tcPr>
+          <w:p>
+            <w:pPr>
+              <w:pStyle w:val="Normal"/>
+              <w:jc w:val="left"/>
+              <w:pBdr>
+                <w:bottom w:val="none" w:sz="0" w:space="0" w:color="000000"/>
+                <w:top w:val="none" w:sz="0" w:space="0" w:color="000000"/>
+                <w:left w:val="none" w:sz="0" w:space="0" w:color="000000"/>
+                <w:right w:val="none" w:sz="0" w:space="0" w:color="000000"/>
+              </w:pBdr>
+              <w:spacing w:after="100" w:before="100" w:line="240"/>
+              <w:ind w:left="100" w:right="100" w:firstLine="0" w:firstLineChars="0"/>
+              <w:rPr>
+                <w:rFonts w:ascii="Times New Roman" w:hAnsi="Times New Roman" w:eastAsia="Times New Roman" w:cs="Times New Roman"/>
+                <w:i w:val="false"/>
+                <w:b w:val="false"/>
+                <w:u w:val="none"/>
+                <w:strike w:val="false"/>
+                <w:sz w:val="18"/>
+                <w:szCs w:val="18"/>
+                <w:color w:val="000000"/>
+              </w:rPr>
+            </w:pPr>
+            <w:r>
+              <w:rPr>
+                <w:rFonts w:ascii="Times New Roman" w:hAnsi="Times New Roman" w:eastAsia="Times New Roman" w:cs="Times New Roman"/>
+                <w:i w:val="false"/>
+                <w:b w:val="false"/>
+                <w:u w:val="none"/>
+                <w:strike w:val="false"/>
+                <w:sz w:val="18"/>
+                <w:szCs w:val="18"/>
+                <w:color w:val="000000"/>
+              </w:rPr>
+              <w:t xml:space="preserve">1981-2024</w:t>
+            </w:r>
+          </w:p>
+        </w:tc>
+        <w:tc>
+          <w:tcPr>
+            <w:tcBorders>
+              <w:bottom w:val="none" w:sz="0" w:space="0" w:color="000000"/>
+              <w:top w:val="none" w:sz="0" w:space="0" w:color="000000"/>
+              <w:left w:val="none" w:sz="0" w:space="0" w:color="000000"/>
+              <w:right w:val="none" w:sz="0" w:space="0" w:color="000000"/>
+            </w:tcBorders>
+            <w:shd w:val="clear" w:color="auto" w:fill="FFFFFF"/>
+            <w:tcMar>
+              <w:top w:w="0" w:type="dxa"/>
+              <w:bottom w:w="0" w:type="dxa"/>
+              <w:left w:w="0" w:type="dxa"/>
+              <w:right w:w="0" w:type="dxa"/>
+            </w:tcMar>
+            <w:vAlign w:val="center"/>
+          </w:tcPr>
+          <w:p>
+            <w:pPr>
+              <w:pStyle w:val="Normal"/>
+              <w:jc w:val="center"/>
+              <w:pBdr>
+                <w:bottom w:val="none" w:sz="0" w:space="0" w:color="000000"/>
+                <w:top w:val="none" w:sz="0" w:space="0" w:color="000000"/>
+                <w:left w:val="none" w:sz="0" w:space="0" w:color="000000"/>
+                <w:right w:val="none" w:sz="0" w:space="0" w:color="000000"/>
+              </w:pBdr>
+              <w:spacing w:after="100" w:before="100" w:line="240"/>
+              <w:ind w:left="100" w:right="100" w:firstLine="0" w:firstLineChars="0"/>
+              <w:rPr>
+                <w:rFonts w:ascii="Times New Roman" w:hAnsi="Times New Roman" w:eastAsia="Times New Roman" w:cs="Times New Roman"/>
+                <w:i w:val="false"/>
+                <w:b w:val="false"/>
+                <w:u w:val="none"/>
+                <w:strike w:val="false"/>
+                <w:sz w:val="18"/>
+                <w:szCs w:val="18"/>
+                <w:color w:val="000000"/>
+              </w:rPr>
+            </w:pPr>
+            <w:r>
+              <w:rPr>
+                <w:rFonts w:ascii="Times New Roman" w:hAnsi="Times New Roman" w:eastAsia="Times New Roman" w:cs="Times New Roman"/>
+                <w:i w:val="false"/>
+                <w:b w:val="false"/>
+                <w:u w:val="none"/>
+                <w:strike w:val="false"/>
+                <w:sz w:val="18"/>
+                <w:szCs w:val="18"/>
+                <w:color w:val="000000"/>
+              </w:rPr>
+              <w:t xml:space="preserve">0.35</w:t>
+            </w:r>
+          </w:p>
+        </w:tc>
+        <w:tc>
+          <w:tcPr>
+            <w:tcBorders>
+              <w:bottom w:val="none" w:sz="0" w:space="0" w:color="000000"/>
+              <w:top w:val="none" w:sz="0" w:space="0" w:color="000000"/>
+              <w:left w:val="none" w:sz="0" w:space="0" w:color="000000"/>
+              <w:right w:val="none" w:sz="0" w:space="0" w:color="000000"/>
+            </w:tcBorders>
+            <w:shd w:val="clear" w:color="auto" w:fill="FFFFFF"/>
+            <w:tcMar>
+              <w:top w:w="0" w:type="dxa"/>
+              <w:bottom w:w="0" w:type="dxa"/>
+              <w:left w:w="0" w:type="dxa"/>
+              <w:right w:w="0" w:type="dxa"/>
+            </w:tcMar>
+            <w:vAlign w:val="center"/>
+          </w:tcPr>
+          <w:p>
+            <w:pPr>
+              <w:pStyle w:val="Normal"/>
+              <w:jc w:val="center"/>
+              <w:pBdr>
+                <w:bottom w:val="none" w:sz="0" w:space="0" w:color="000000"/>
+                <w:top w:val="none" w:sz="0" w:space="0" w:color="000000"/>
+                <w:left w:val="none" w:sz="0" w:space="0" w:color="000000"/>
+                <w:right w:val="none" w:sz="0" w:space="0" w:color="000000"/>
+              </w:pBdr>
+              <w:spacing w:after="100" w:before="100" w:line="240"/>
+              <w:ind w:left="100" w:right="100" w:firstLine="0" w:firstLineChars="0"/>
+              <w:rPr>
+                <w:rFonts w:ascii="Times New Roman" w:hAnsi="Times New Roman" w:eastAsia="Times New Roman" w:cs="Times New Roman"/>
+                <w:i w:val="false"/>
+                <w:b w:val="false"/>
+                <w:u w:val="none"/>
+                <w:strike w:val="false"/>
+                <w:sz w:val="18"/>
+                <w:szCs w:val="18"/>
+                <w:color w:val="000000"/>
+              </w:rPr>
+            </w:pPr>
+            <w:r>
+              <w:rPr>
+                <w:rFonts w:ascii="Times New Roman" w:hAnsi="Times New Roman" w:eastAsia="Times New Roman" w:cs="Times New Roman"/>
+                <w:i w:val="false"/>
+                <w:b w:val="false"/>
+                <w:u w:val="none"/>
+                <w:strike w:val="false"/>
+                <w:sz w:val="18"/>
+                <w:szCs w:val="18"/>
+                <w:color w:val="000000"/>
+              </w:rPr>
+              <w:t xml:space="preserve">-1.21</w:t>
+            </w:r>
+          </w:p>
+        </w:tc>
+        <w:tc>
+          <w:tcPr>
+            <w:tcBorders>
+              <w:bottom w:val="none" w:sz="0" w:space="0" w:color="000000"/>
+              <w:top w:val="none" w:sz="0" w:space="0" w:color="000000"/>
+              <w:left w:val="none" w:sz="0" w:space="0" w:color="000000"/>
+              <w:right w:val="none" w:sz="0" w:space="0" w:color="000000"/>
+            </w:tcBorders>
+            <w:shd w:val="clear" w:color="auto" w:fill="FFFFFF"/>
+            <w:tcMar>
+              <w:top w:w="0" w:type="dxa"/>
+              <w:bottom w:w="0" w:type="dxa"/>
+              <w:left w:w="0" w:type="dxa"/>
+              <w:right w:w="0" w:type="dxa"/>
+            </w:tcMar>
+            <w:vAlign w:val="center"/>
+          </w:tcPr>
+          <w:p>
+            <w:pPr>
+              <w:pStyle w:val="Normal"/>
+              <w:jc w:val="center"/>
+              <w:pBdr>
+                <w:bottom w:val="none" w:sz="0" w:space="0" w:color="000000"/>
+                <w:top w:val="none" w:sz="0" w:space="0" w:color="000000"/>
+                <w:left w:val="none" w:sz="0" w:space="0" w:color="000000"/>
+                <w:right w:val="none" w:sz="0" w:space="0" w:color="000000"/>
+              </w:pBdr>
+              <w:spacing w:after="100" w:before="100" w:line="240"/>
+              <w:ind w:left="100" w:right="100" w:firstLine="0" w:firstLineChars="0"/>
+              <w:rPr>
+                <w:rFonts w:ascii="Times New Roman" w:hAnsi="Times New Roman" w:eastAsia="Times New Roman" w:cs="Times New Roman"/>
+                <w:i w:val="false"/>
+                <w:b w:val="false"/>
+                <w:u w:val="none"/>
+                <w:strike w:val="false"/>
+                <w:sz w:val="18"/>
+                <w:szCs w:val="18"/>
+                <w:color w:val="000000"/>
+              </w:rPr>
+            </w:pPr>
+            <w:r>
+              <w:rPr>
+                <w:rFonts w:ascii="Times New Roman" w:hAnsi="Times New Roman" w:eastAsia="Times New Roman" w:cs="Times New Roman"/>
+                <w:i w:val="false"/>
+                <w:b w:val="false"/>
+                <w:u w:val="none"/>
+                <w:strike w:val="false"/>
+                <w:sz w:val="18"/>
+                <w:szCs w:val="18"/>
+                <w:color w:val="000000"/>
+              </w:rPr>
+              <w:t xml:space="preserve">1.59</w:t>
+            </w:r>
+          </w:p>
+        </w:tc>
+        <w:tc>
+          <w:tcPr>
+            <w:tcBorders>
+              <w:bottom w:val="none" w:sz="0" w:space="0" w:color="000000"/>
+              <w:top w:val="none" w:sz="0" w:space="0" w:color="000000"/>
+              <w:left w:val="none" w:sz="0" w:space="0" w:color="000000"/>
+              <w:right w:val="none" w:sz="0" w:space="0" w:color="000000"/>
+            </w:tcBorders>
+            <w:shd w:val="clear" w:color="auto" w:fill="FFFFFF"/>
+            <w:tcMar>
+              <w:top w:w="0" w:type="dxa"/>
+              <w:bottom w:w="0" w:type="dxa"/>
+              <w:left w:w="0" w:type="dxa"/>
+              <w:right w:w="0" w:type="dxa"/>
+            </w:tcMar>
+            <w:vAlign w:val="center"/>
+          </w:tcPr>
+          <w:p>
+            <w:pPr>
+              <w:pStyle w:val="Normal"/>
+              <w:jc w:val="center"/>
+              <w:pBdr>
+                <w:bottom w:val="none" w:sz="0" w:space="0" w:color="000000"/>
+                <w:top w:val="none" w:sz="0" w:space="0" w:color="000000"/>
+                <w:left w:val="none" w:sz="0" w:space="0" w:color="000000"/>
+                <w:right w:val="none" w:sz="0" w:space="0" w:color="000000"/>
+              </w:pBdr>
+              <w:spacing w:after="100" w:before="100" w:line="240"/>
+              <w:ind w:left="100" w:right="100" w:firstLine="0" w:firstLineChars="0"/>
+              <w:rPr>
+                <w:rFonts w:ascii="Times New Roman" w:hAnsi="Times New Roman" w:eastAsia="Times New Roman" w:cs="Times New Roman"/>
+                <w:i w:val="false"/>
+                <w:b w:val="false"/>
+                <w:u w:val="none"/>
+                <w:strike w:val="false"/>
+                <w:sz w:val="18"/>
+                <w:szCs w:val="18"/>
+                <w:color w:val="000000"/>
+              </w:rPr>
+            </w:pPr>
+            <w:r>
+              <w:rPr>
+                <w:rFonts w:ascii="Times New Roman" w:hAnsi="Times New Roman" w:eastAsia="Times New Roman" w:cs="Times New Roman"/>
+                <w:i w:val="false"/>
+                <w:b w:val="false"/>
+                <w:u w:val="none"/>
+                <w:strike w:val="false"/>
+                <w:sz w:val="18"/>
+                <w:szCs w:val="18"/>
+                <w:color w:val="000000"/>
+              </w:rPr>
+              <w:t xml:space="preserve">3.46</w:t>
+            </w:r>
+          </w:p>
+        </w:tc>
+      </w:tr>
+      <w:tr>
+        <w:trPr>
+          <w:trHeight w:val="360" w:hRule="auto"/>
+        </w:trPr>
+        <w:tc>
+          <w:tcPr>
+            <w:tcBorders>
+              <w:bottom w:val="none" w:sz="0" w:space="0" w:color="000000"/>
+              <w:top w:val="none" w:sz="0" w:space="0" w:color="000000"/>
+              <w:left w:val="none" w:sz="0" w:space="0" w:color="000000"/>
+              <w:right w:val="none" w:sz="0" w:space="0" w:color="000000"/>
+            </w:tcBorders>
+            <w:shd w:val="clear" w:color="auto" w:fill="FFFFFF"/>
+            <w:tcMar>
+              <w:top w:w="0" w:type="dxa"/>
+              <w:bottom w:w="0" w:type="dxa"/>
+              <w:left w:w="0" w:type="dxa"/>
+              <w:right w:w="0" w:type="dxa"/>
+            </w:tcMar>
+            <w:vAlign w:val="center"/>
+          </w:tcPr>
+          <w:p>
+            <w:pPr>
+              <w:pStyle w:val="Normal"/>
+              <w:jc w:val="left"/>
+              <w:pBdr>
+                <w:bottom w:val="none" w:sz="0" w:space="0" w:color="000000"/>
+                <w:top w:val="none" w:sz="0" w:space="0" w:color="000000"/>
+                <w:left w:val="none" w:sz="0" w:space="0" w:color="000000"/>
+                <w:right w:val="none" w:sz="0" w:space="0" w:color="000000"/>
+              </w:pBdr>
+              <w:spacing w:after="100" w:before="100" w:line="240"/>
+              <w:ind w:left="100" w:right="100" w:firstLine="0" w:firstLineChars="0"/>
+              <w:rPr>
+                <w:rFonts w:ascii="Times New Roman" w:hAnsi="Times New Roman" w:eastAsia="Times New Roman" w:cs="Times New Roman"/>
+                <w:i w:val="false"/>
+                <w:b w:val="false"/>
+                <w:u w:val="none"/>
+                <w:strike w:val="false"/>
+                <w:sz w:val="18"/>
+                <w:szCs w:val="18"/>
+                <w:color w:val="000000"/>
+              </w:rPr>
+            </w:pPr>
+            <w:r>
+              <w:rPr>
+                <w:rFonts w:ascii="Times New Roman" w:hAnsi="Times New Roman" w:eastAsia="Times New Roman" w:cs="Times New Roman"/>
+                <w:i w:val="false"/>
+                <w:b w:val="false"/>
+                <w:u w:val="none"/>
+                <w:strike w:val="false"/>
+                <w:sz w:val="18"/>
+                <w:szCs w:val="18"/>
+                <w:color w:val="000000"/>
+              </w:rPr>
+              <w:t xml:space="preserve">United Kingdom</w:t>
+            </w:r>
+          </w:p>
+        </w:tc>
+        <w:tc>
+          <w:tcPr>
+            <w:tcBorders>
+              <w:bottom w:val="none" w:sz="0" w:space="0" w:color="000000"/>
+              <w:top w:val="none" w:sz="0" w:space="0" w:color="000000"/>
+              <w:left w:val="none" w:sz="0" w:space="0" w:color="000000"/>
+              <w:right w:val="none" w:sz="0" w:space="0" w:color="000000"/>
+            </w:tcBorders>
+            <w:shd w:val="clear" w:color="auto" w:fill="FFFFFF"/>
+            <w:tcMar>
+              <w:top w:w="0" w:type="dxa"/>
+              <w:bottom w:w="0" w:type="dxa"/>
+              <w:left w:w="0" w:type="dxa"/>
+              <w:right w:w="0" w:type="dxa"/>
+            </w:tcMar>
+            <w:vAlign w:val="center"/>
+          </w:tcPr>
+          <w:p>
+            <w:pPr>
+              <w:pStyle w:val="Normal"/>
+              <w:jc w:val="left"/>
+              <w:pBdr>
+                <w:bottom w:val="none" w:sz="0" w:space="0" w:color="000000"/>
+                <w:top w:val="none" w:sz="0" w:space="0" w:color="000000"/>
+                <w:left w:val="none" w:sz="0" w:space="0" w:color="000000"/>
+                <w:right w:val="none" w:sz="0" w:space="0" w:color="000000"/>
+              </w:pBdr>
+              <w:spacing w:after="100" w:before="100" w:line="240"/>
+              <w:ind w:left="100" w:right="100" w:firstLine="0" w:firstLineChars="0"/>
+              <w:rPr>
+                <w:rFonts w:ascii="Times New Roman" w:hAnsi="Times New Roman" w:eastAsia="Times New Roman" w:cs="Times New Roman"/>
+                <w:i w:val="false"/>
+                <w:b w:val="false"/>
+                <w:u w:val="none"/>
+                <w:strike w:val="false"/>
+                <w:sz w:val="18"/>
+                <w:szCs w:val="18"/>
+                <w:color w:val="000000"/>
+              </w:rPr>
+            </w:pPr>
+            <w:r>
+              <w:rPr>
+                <w:rFonts w:ascii="Times New Roman" w:hAnsi="Times New Roman" w:eastAsia="Times New Roman" w:cs="Times New Roman"/>
+                <w:i w:val="false"/>
+                <w:b w:val="false"/>
+                <w:u w:val="none"/>
+                <w:strike w:val="false"/>
+                <w:sz w:val="18"/>
+                <w:szCs w:val="18"/>
+                <w:color w:val="000000"/>
+              </w:rPr>
+              <w:t xml:space="preserve">1981-2024</w:t>
+            </w:r>
+          </w:p>
+        </w:tc>
+        <w:tc>
+          <w:tcPr>
+            <w:tcBorders>
+              <w:bottom w:val="none" w:sz="0" w:space="0" w:color="000000"/>
+              <w:top w:val="none" w:sz="0" w:space="0" w:color="000000"/>
+              <w:left w:val="none" w:sz="0" w:space="0" w:color="000000"/>
+              <w:right w:val="none" w:sz="0" w:space="0" w:color="000000"/>
+            </w:tcBorders>
+            <w:shd w:val="clear" w:color="auto" w:fill="FFFFFF"/>
+            <w:tcMar>
+              <w:top w:w="0" w:type="dxa"/>
+              <w:bottom w:w="0" w:type="dxa"/>
+              <w:left w:w="0" w:type="dxa"/>
+              <w:right w:w="0" w:type="dxa"/>
+            </w:tcMar>
+            <w:vAlign w:val="center"/>
+          </w:tcPr>
+          <w:p>
+            <w:pPr>
+              <w:pStyle w:val="Normal"/>
+              <w:jc w:val="center"/>
+              <w:pBdr>
+                <w:bottom w:val="none" w:sz="0" w:space="0" w:color="000000"/>
+                <w:top w:val="none" w:sz="0" w:space="0" w:color="000000"/>
+                <w:left w:val="none" w:sz="0" w:space="0" w:color="000000"/>
+                <w:right w:val="none" w:sz="0" w:space="0" w:color="000000"/>
+              </w:pBdr>
+              <w:spacing w:after="100" w:before="100" w:line="240"/>
+              <w:ind w:left="100" w:right="100" w:firstLine="0" w:firstLineChars="0"/>
+              <w:rPr>
+                <w:rFonts w:ascii="Times New Roman" w:hAnsi="Times New Roman" w:eastAsia="Times New Roman" w:cs="Times New Roman"/>
+                <w:i w:val="false"/>
+                <w:b w:val="false"/>
+                <w:u w:val="none"/>
+                <w:strike w:val="false"/>
+                <w:sz w:val="18"/>
+                <w:szCs w:val="18"/>
+                <w:color w:val="000000"/>
+              </w:rPr>
+            </w:pPr>
+            <w:r>
+              <w:rPr>
+                <w:rFonts w:ascii="Times New Roman" w:hAnsi="Times New Roman" w:eastAsia="Times New Roman" w:cs="Times New Roman"/>
+                <w:i w:val="false"/>
+                <w:b w:val="false"/>
+                <w:u w:val="none"/>
+                <w:strike w:val="false"/>
+                <w:sz w:val="18"/>
+                <w:szCs w:val="18"/>
+                <w:color w:val="000000"/>
+              </w:rPr>
+              <w:t xml:space="preserve">0.18</w:t>
+            </w:r>
+          </w:p>
+        </w:tc>
+        <w:tc>
+          <w:tcPr>
+            <w:tcBorders>
+              <w:bottom w:val="none" w:sz="0" w:space="0" w:color="000000"/>
+              <w:top w:val="none" w:sz="0" w:space="0" w:color="000000"/>
+              <w:left w:val="none" w:sz="0" w:space="0" w:color="000000"/>
+              <w:right w:val="none" w:sz="0" w:space="0" w:color="000000"/>
+            </w:tcBorders>
+            <w:shd w:val="clear" w:color="auto" w:fill="FFFFFF"/>
+            <w:tcMar>
+              <w:top w:w="0" w:type="dxa"/>
+              <w:bottom w:w="0" w:type="dxa"/>
+              <w:left w:w="0" w:type="dxa"/>
+              <w:right w:w="0" w:type="dxa"/>
+            </w:tcMar>
+            <w:vAlign w:val="center"/>
+          </w:tcPr>
+          <w:p>
+            <w:pPr>
+              <w:pStyle w:val="Normal"/>
+              <w:jc w:val="center"/>
+              <w:pBdr>
+                <w:bottom w:val="none" w:sz="0" w:space="0" w:color="000000"/>
+                <w:top w:val="none" w:sz="0" w:space="0" w:color="000000"/>
+                <w:left w:val="none" w:sz="0" w:space="0" w:color="000000"/>
+                <w:right w:val="none" w:sz="0" w:space="0" w:color="000000"/>
+              </w:pBdr>
+              <w:spacing w:after="100" w:before="100" w:line="240"/>
+              <w:ind w:left="100" w:right="100" w:firstLine="0" w:firstLineChars="0"/>
+              <w:rPr>
+                <w:rFonts w:ascii="Times New Roman" w:hAnsi="Times New Roman" w:eastAsia="Times New Roman" w:cs="Times New Roman"/>
+                <w:i w:val="false"/>
+                <w:b w:val="false"/>
+                <w:u w:val="none"/>
+                <w:strike w:val="false"/>
+                <w:sz w:val="18"/>
+                <w:szCs w:val="18"/>
+                <w:color w:val="000000"/>
+              </w:rPr>
+            </w:pPr>
+            <w:r>
+              <w:rPr>
+                <w:rFonts w:ascii="Times New Roman" w:hAnsi="Times New Roman" w:eastAsia="Times New Roman" w:cs="Times New Roman"/>
+                <w:i w:val="false"/>
+                <w:b w:val="false"/>
+                <w:u w:val="none"/>
+                <w:strike w:val="false"/>
+                <w:sz w:val="18"/>
+                <w:szCs w:val="18"/>
+                <w:color w:val="000000"/>
+              </w:rPr>
+              <w:t xml:space="preserve">-1.88</w:t>
+            </w:r>
+          </w:p>
+        </w:tc>
+        <w:tc>
+          <w:tcPr>
+            <w:tcBorders>
+              <w:bottom w:val="none" w:sz="0" w:space="0" w:color="000000"/>
+              <w:top w:val="none" w:sz="0" w:space="0" w:color="000000"/>
+              <w:left w:val="none" w:sz="0" w:space="0" w:color="000000"/>
+              <w:right w:val="none" w:sz="0" w:space="0" w:color="000000"/>
+            </w:tcBorders>
+            <w:shd w:val="clear" w:color="auto" w:fill="FFFFFF"/>
+            <w:tcMar>
+              <w:top w:w="0" w:type="dxa"/>
+              <w:bottom w:w="0" w:type="dxa"/>
+              <w:left w:w="0" w:type="dxa"/>
+              <w:right w:w="0" w:type="dxa"/>
+            </w:tcMar>
+            <w:vAlign w:val="center"/>
+          </w:tcPr>
+          <w:p>
+            <w:pPr>
+              <w:pStyle w:val="Normal"/>
+              <w:jc w:val="center"/>
+              <w:pBdr>
+                <w:bottom w:val="none" w:sz="0" w:space="0" w:color="000000"/>
+                <w:top w:val="none" w:sz="0" w:space="0" w:color="000000"/>
+                <w:left w:val="none" w:sz="0" w:space="0" w:color="000000"/>
+                <w:right w:val="none" w:sz="0" w:space="0" w:color="000000"/>
+              </w:pBdr>
+              <w:spacing w:after="100" w:before="100" w:line="240"/>
+              <w:ind w:left="100" w:right="100" w:firstLine="0" w:firstLineChars="0"/>
+              <w:rPr>
+                <w:rFonts w:ascii="Times New Roman" w:hAnsi="Times New Roman" w:eastAsia="Times New Roman" w:cs="Times New Roman"/>
+                <w:i w:val="false"/>
+                <w:b w:val="false"/>
+                <w:u w:val="none"/>
+                <w:strike w:val="false"/>
+                <w:sz w:val="18"/>
+                <w:szCs w:val="18"/>
+                <w:color w:val="000000"/>
+              </w:rPr>
+            </w:pPr>
+            <w:r>
+              <w:rPr>
+                <w:rFonts w:ascii="Times New Roman" w:hAnsi="Times New Roman" w:eastAsia="Times New Roman" w:cs="Times New Roman"/>
+                <w:i w:val="false"/>
+                <w:b w:val="false"/>
+                <w:u w:val="none"/>
+                <w:strike w:val="false"/>
+                <w:sz w:val="18"/>
+                <w:szCs w:val="18"/>
+                <w:color w:val="000000"/>
+              </w:rPr>
+              <w:t xml:space="preserve">2.12</w:t>
+            </w:r>
+          </w:p>
+        </w:tc>
+        <w:tc>
+          <w:tcPr>
+            <w:tcBorders>
+              <w:bottom w:val="none" w:sz="0" w:space="0" w:color="000000"/>
+              <w:top w:val="none" w:sz="0" w:space="0" w:color="000000"/>
+              <w:left w:val="none" w:sz="0" w:space="0" w:color="000000"/>
+              <w:right w:val="none" w:sz="0" w:space="0" w:color="000000"/>
+            </w:tcBorders>
+            <w:shd w:val="clear" w:color="auto" w:fill="FFFFFF"/>
+            <w:tcMar>
+              <w:top w:w="0" w:type="dxa"/>
+              <w:bottom w:w="0" w:type="dxa"/>
+              <w:left w:w="0" w:type="dxa"/>
+              <w:right w:w="0" w:type="dxa"/>
+            </w:tcMar>
+            <w:vAlign w:val="center"/>
+          </w:tcPr>
+          <w:p>
+            <w:pPr>
+              <w:pStyle w:val="Normal"/>
+              <w:jc w:val="center"/>
+              <w:pBdr>
+                <w:bottom w:val="none" w:sz="0" w:space="0" w:color="000000"/>
+                <w:top w:val="none" w:sz="0" w:space="0" w:color="000000"/>
+                <w:left w:val="none" w:sz="0" w:space="0" w:color="000000"/>
+                <w:right w:val="none" w:sz="0" w:space="0" w:color="000000"/>
+              </w:pBdr>
+              <w:spacing w:after="100" w:before="100" w:line="240"/>
+              <w:ind w:left="100" w:right="100" w:firstLine="0" w:firstLineChars="0"/>
+              <w:rPr>
+                <w:rFonts w:ascii="Times New Roman" w:hAnsi="Times New Roman" w:eastAsia="Times New Roman" w:cs="Times New Roman"/>
+                <w:i w:val="false"/>
+                <w:b w:val="false"/>
+                <w:u w:val="none"/>
+                <w:strike w:val="false"/>
+                <w:sz w:val="18"/>
+                <w:szCs w:val="18"/>
+                <w:color w:val="000000"/>
+              </w:rPr>
+            </w:pPr>
+            <w:r>
+              <w:rPr>
+                <w:rFonts w:ascii="Times New Roman" w:hAnsi="Times New Roman" w:eastAsia="Times New Roman" w:cs="Times New Roman"/>
+                <w:i w:val="false"/>
+                <w:b w:val="false"/>
+                <w:u w:val="none"/>
+                <w:strike w:val="false"/>
+                <w:sz w:val="18"/>
+                <w:szCs w:val="18"/>
+                <w:color w:val="000000"/>
+              </w:rPr>
+              <w:t xml:space="preserve">0.33</w:t>
+            </w:r>
+          </w:p>
+        </w:tc>
+      </w:tr>
+      <w:tr>
+        <w:trPr>
+          <w:trHeight w:val="360" w:hRule="auto"/>
+        </w:trPr>
+        <w:tc>
+          <w:tcPr>
+            <w:tcBorders>
+              <w:bottom w:val="single" w:sz="12" w:space="0" w:color="666666"/>
+              <w:top w:val="none" w:sz="0" w:space="0" w:color="000000"/>
+              <w:left w:val="none" w:sz="0" w:space="0" w:color="000000"/>
+              <w:right w:val="none" w:sz="0" w:space="0" w:color="000000"/>
+            </w:tcBorders>
+            <w:shd w:val="clear" w:color="auto" w:fill="FFFFFF"/>
+            <w:tcMar>
+              <w:top w:w="0" w:type="dxa"/>
+              <w:bottom w:w="0" w:type="dxa"/>
+              <w:left w:w="0" w:type="dxa"/>
+              <w:right w:w="0" w:type="dxa"/>
+            </w:tcMar>
+            <w:vAlign w:val="center"/>
+          </w:tcPr>
+          <w:p>
+            <w:pPr>
+              <w:pStyle w:val="Normal"/>
+              <w:jc w:val="left"/>
+              <w:pBdr>
+                <w:bottom w:val="none" w:sz="0" w:space="0" w:color="000000"/>
+                <w:top w:val="none" w:sz="0" w:space="0" w:color="000000"/>
+                <w:left w:val="none" w:sz="0" w:space="0" w:color="000000"/>
+                <w:right w:val="none" w:sz="0" w:space="0" w:color="000000"/>
+              </w:pBdr>
+              <w:spacing w:after="100" w:before="100" w:line="240"/>
+              <w:ind w:left="100" w:right="100" w:firstLine="0" w:firstLineChars="0"/>
+              <w:rPr>
+                <w:rFonts w:ascii="Times New Roman" w:hAnsi="Times New Roman" w:eastAsia="Times New Roman" w:cs="Times New Roman"/>
+                <w:i w:val="false"/>
+                <w:b w:val="true"/>
+                <w:u w:val="none"/>
+                <w:strike w:val="false"/>
+                <w:sz w:val="18"/>
+                <w:szCs w:val="18"/>
+                <w:color w:val="000000"/>
+              </w:rPr>
+            </w:pPr>
+            <w:r>
+              <w:rPr>
+                <w:rFonts w:ascii="Times New Roman" w:hAnsi="Times New Roman" w:eastAsia="Times New Roman" w:cs="Times New Roman"/>
+                <w:i w:val="false"/>
+                <w:b w:val="true"/>
+                <w:u w:val="none"/>
+                <w:strike w:val="false"/>
+                <w:sz w:val="18"/>
+                <w:szCs w:val="18"/>
+                <w:color w:val="000000"/>
+              </w:rPr>
+              <w:t xml:space="preserve">FRUK</w:t>
+            </w:r>
+          </w:p>
+        </w:tc>
+        <w:tc>
+          <w:tcPr>
+            <w:tcBorders>
+              <w:bottom w:val="single" w:sz="12" w:space="0" w:color="666666"/>
+              <w:top w:val="none" w:sz="0" w:space="0" w:color="000000"/>
+              <w:left w:val="none" w:sz="0" w:space="0" w:color="000000"/>
+              <w:right w:val="none" w:sz="0" w:space="0" w:color="000000"/>
+            </w:tcBorders>
+            <w:shd w:val="clear" w:color="auto" w:fill="FFFFFF"/>
+            <w:tcMar>
+              <w:top w:w="0" w:type="dxa"/>
+              <w:bottom w:w="0" w:type="dxa"/>
+              <w:left w:w="0" w:type="dxa"/>
+              <w:right w:w="0" w:type="dxa"/>
+            </w:tcMar>
+            <w:vAlign w:val="center"/>
+          </w:tcPr>
+          <w:p>
+            <w:pPr>
+              <w:pStyle w:val="Normal"/>
+              <w:jc w:val="left"/>
+              <w:pBdr>
+                <w:bottom w:val="none" w:sz="0" w:space="0" w:color="000000"/>
+                <w:top w:val="none" w:sz="0" w:space="0" w:color="000000"/>
+                <w:left w:val="none" w:sz="0" w:space="0" w:color="000000"/>
+                <w:right w:val="none" w:sz="0" w:space="0" w:color="000000"/>
+              </w:pBdr>
+              <w:spacing w:after="100" w:before="100" w:line="240"/>
+              <w:ind w:left="100" w:right="100" w:firstLine="0" w:firstLineChars="0"/>
+              <w:rPr>
+                <w:rFonts w:ascii="Times New Roman" w:hAnsi="Times New Roman" w:eastAsia="Times New Roman" w:cs="Times New Roman"/>
+                <w:i w:val="false"/>
+                <w:b w:val="true"/>
+                <w:u w:val="none"/>
+                <w:strike w:val="false"/>
+                <w:sz w:val="18"/>
+                <w:szCs w:val="18"/>
+                <w:color w:val="000000"/>
+              </w:rPr>
+            </w:pPr>
+            <w:r>
+              <w:rPr>
+                <w:rFonts w:ascii="Times New Roman" w:hAnsi="Times New Roman" w:eastAsia="Times New Roman" w:cs="Times New Roman"/>
+                <w:i w:val="false"/>
+                <w:b w:val="true"/>
+                <w:u w:val="none"/>
+                <w:strike w:val="false"/>
+                <w:sz w:val="18"/>
+                <w:szCs w:val="18"/>
+                <w:color w:val="000000"/>
+              </w:rPr>
+              <w:t xml:space="preserve"/>
+            </w:r>
+          </w:p>
+        </w:tc>
+        <w:tc>
+          <w:tcPr>
+            <w:tcBorders>
+              <w:bottom w:val="single" w:sz="12" w:space="0" w:color="666666"/>
+              <w:top w:val="none" w:sz="0" w:space="0" w:color="000000"/>
+              <w:left w:val="none" w:sz="0" w:space="0" w:color="000000"/>
+              <w:right w:val="none" w:sz="0" w:space="0" w:color="000000"/>
+            </w:tcBorders>
+            <w:shd w:val="clear" w:color="auto" w:fill="FFFFFF"/>
+            <w:tcMar>
+              <w:top w:w="0" w:type="dxa"/>
+              <w:bottom w:w="0" w:type="dxa"/>
+              <w:left w:w="0" w:type="dxa"/>
+              <w:right w:w="0" w:type="dxa"/>
+            </w:tcMar>
+            <w:vAlign w:val="center"/>
+          </w:tcPr>
+          <w:p>
+            <w:pPr>
+              <w:pStyle w:val="Normal"/>
+              <w:jc w:val="center"/>
+              <w:pBdr>
+                <w:bottom w:val="none" w:sz="0" w:space="0" w:color="000000"/>
+                <w:top w:val="none" w:sz="0" w:space="0" w:color="000000"/>
+                <w:left w:val="none" w:sz="0" w:space="0" w:color="000000"/>
+                <w:right w:val="none" w:sz="0" w:space="0" w:color="000000"/>
+              </w:pBdr>
+              <w:spacing w:after="100" w:before="100" w:line="240"/>
+              <w:ind w:left="100" w:right="100" w:firstLine="0" w:firstLineChars="0"/>
+              <w:rPr>
+                <w:rFonts w:ascii="Times New Roman" w:hAnsi="Times New Roman" w:eastAsia="Times New Roman" w:cs="Times New Roman"/>
+                <w:i w:val="false"/>
+                <w:b w:val="true"/>
+                <w:u w:val="none"/>
+                <w:strike w:val="false"/>
+                <w:sz w:val="18"/>
+                <w:szCs w:val="18"/>
+                <w:color w:val="000000"/>
+              </w:rPr>
+            </w:pPr>
+            <w:r>
+              <w:rPr>
+                <w:rFonts w:ascii="Times New Roman" w:hAnsi="Times New Roman" w:eastAsia="Times New Roman" w:cs="Times New Roman"/>
+                <w:i w:val="false"/>
+                <w:b w:val="true"/>
+                <w:u w:val="none"/>
+                <w:strike w:val="false"/>
+                <w:sz w:val="18"/>
+                <w:szCs w:val="18"/>
+                <w:color w:val="000000"/>
+              </w:rPr>
+              <w:t xml:space="preserve">0.27</w:t>
+            </w:r>
+          </w:p>
+        </w:tc>
+        <w:tc>
+          <w:tcPr>
+            <w:tcBorders>
+              <w:bottom w:val="single" w:sz="12" w:space="0" w:color="666666"/>
+              <w:top w:val="none" w:sz="0" w:space="0" w:color="000000"/>
+              <w:left w:val="none" w:sz="0" w:space="0" w:color="000000"/>
+              <w:right w:val="none" w:sz="0" w:space="0" w:color="000000"/>
+            </w:tcBorders>
+            <w:shd w:val="clear" w:color="auto" w:fill="FFFFFF"/>
+            <w:tcMar>
+              <w:top w:w="0" w:type="dxa"/>
+              <w:bottom w:w="0" w:type="dxa"/>
+              <w:left w:w="0" w:type="dxa"/>
+              <w:right w:w="0" w:type="dxa"/>
+            </w:tcMar>
+            <w:vAlign w:val="center"/>
+          </w:tcPr>
+          <w:p>
+            <w:pPr>
+              <w:pStyle w:val="Normal"/>
+              <w:jc w:val="center"/>
+              <w:pBdr>
+                <w:bottom w:val="none" w:sz="0" w:space="0" w:color="000000"/>
+                <w:top w:val="none" w:sz="0" w:space="0" w:color="000000"/>
+                <w:left w:val="none" w:sz="0" w:space="0" w:color="000000"/>
+                <w:right w:val="none" w:sz="0" w:space="0" w:color="000000"/>
+              </w:pBdr>
+              <w:spacing w:after="100" w:before="100" w:line="240"/>
+              <w:ind w:left="100" w:right="100" w:firstLine="0" w:firstLineChars="0"/>
+              <w:rPr>
+                <w:rFonts w:ascii="Times New Roman" w:hAnsi="Times New Roman" w:eastAsia="Times New Roman" w:cs="Times New Roman"/>
+                <w:i w:val="false"/>
+                <w:b w:val="true"/>
+                <w:u w:val="none"/>
+                <w:strike w:val="false"/>
+                <w:sz w:val="18"/>
+                <w:szCs w:val="18"/>
+                <w:color w:val="000000"/>
+              </w:rPr>
+            </w:pPr>
+            <w:r>
+              <w:rPr>
+                <w:rFonts w:ascii="Times New Roman" w:hAnsi="Times New Roman" w:eastAsia="Times New Roman" w:cs="Times New Roman"/>
+                <w:i w:val="false"/>
+                <w:b w:val="true"/>
+                <w:u w:val="none"/>
+                <w:strike w:val="false"/>
+                <w:sz w:val="18"/>
+                <w:szCs w:val="18"/>
+                <w:color w:val="000000"/>
+              </w:rPr>
+              <w:t xml:space="preserve">-1.54</w:t>
+            </w:r>
+          </w:p>
+        </w:tc>
+        <w:tc>
+          <w:tcPr>
+            <w:tcBorders>
+              <w:bottom w:val="single" w:sz="12" w:space="0" w:color="666666"/>
+              <w:top w:val="none" w:sz="0" w:space="0" w:color="000000"/>
+              <w:left w:val="none" w:sz="0" w:space="0" w:color="000000"/>
+              <w:right w:val="none" w:sz="0" w:space="0" w:color="000000"/>
+            </w:tcBorders>
+            <w:shd w:val="clear" w:color="auto" w:fill="FFFFFF"/>
+            <w:tcMar>
+              <w:top w:w="0" w:type="dxa"/>
+              <w:bottom w:w="0" w:type="dxa"/>
+              <w:left w:w="0" w:type="dxa"/>
+              <w:right w:w="0" w:type="dxa"/>
+            </w:tcMar>
+            <w:vAlign w:val="center"/>
+          </w:tcPr>
+          <w:p>
+            <w:pPr>
+              <w:pStyle w:val="Normal"/>
+              <w:jc w:val="center"/>
+              <w:pBdr>
+                <w:bottom w:val="none" w:sz="0" w:space="0" w:color="000000"/>
+                <w:top w:val="none" w:sz="0" w:space="0" w:color="000000"/>
+                <w:left w:val="none" w:sz="0" w:space="0" w:color="000000"/>
+                <w:right w:val="none" w:sz="0" w:space="0" w:color="000000"/>
+              </w:pBdr>
+              <w:spacing w:after="100" w:before="100" w:line="240"/>
+              <w:ind w:left="100" w:right="100" w:firstLine="0" w:firstLineChars="0"/>
+              <w:rPr>
+                <w:rFonts w:ascii="Times New Roman" w:hAnsi="Times New Roman" w:eastAsia="Times New Roman" w:cs="Times New Roman"/>
+                <w:i w:val="false"/>
+                <w:b w:val="true"/>
+                <w:u w:val="none"/>
+                <w:strike w:val="false"/>
+                <w:sz w:val="18"/>
+                <w:szCs w:val="18"/>
+                <w:color w:val="000000"/>
+              </w:rPr>
+            </w:pPr>
+            <w:r>
+              <w:rPr>
+                <w:rFonts w:ascii="Times New Roman" w:hAnsi="Times New Roman" w:eastAsia="Times New Roman" w:cs="Times New Roman"/>
+                <w:i w:val="false"/>
+                <w:b w:val="true"/>
+                <w:u w:val="none"/>
+                <w:strike w:val="false"/>
+                <w:sz w:val="18"/>
+                <w:szCs w:val="18"/>
+                <w:color w:val="000000"/>
+              </w:rPr>
+              <w:t xml:space="preserve">1.85</w:t>
+            </w:r>
+          </w:p>
+        </w:tc>
+        <w:tc>
+          <w:tcPr>
+            <w:tcBorders>
+              <w:bottom w:val="single" w:sz="12" w:space="0" w:color="666666"/>
+              <w:top w:val="none" w:sz="0" w:space="0" w:color="000000"/>
+              <w:left w:val="none" w:sz="0" w:space="0" w:color="000000"/>
+              <w:right w:val="none" w:sz="0" w:space="0" w:color="000000"/>
+            </w:tcBorders>
+            <w:shd w:val="clear" w:color="auto" w:fill="FFFFFF"/>
+            <w:tcMar>
+              <w:top w:w="0" w:type="dxa"/>
+              <w:bottom w:w="0" w:type="dxa"/>
+              <w:left w:w="0" w:type="dxa"/>
+              <w:right w:w="0" w:type="dxa"/>
+            </w:tcMar>
+            <w:vAlign w:val="center"/>
+          </w:tcPr>
+          <w:p>
+            <w:pPr>
+              <w:pStyle w:val="Normal"/>
+              <w:jc w:val="center"/>
+              <w:pBdr>
+                <w:bottom w:val="none" w:sz="0" w:space="0" w:color="000000"/>
+                <w:top w:val="none" w:sz="0" w:space="0" w:color="000000"/>
+                <w:left w:val="none" w:sz="0" w:space="0" w:color="000000"/>
+                <w:right w:val="none" w:sz="0" w:space="0" w:color="000000"/>
+              </w:pBdr>
+              <w:spacing w:after="100" w:before="100" w:line="240"/>
+              <w:ind w:left="100" w:right="100" w:firstLine="0" w:firstLineChars="0"/>
+              <w:rPr>
+                <w:rFonts w:ascii="Times New Roman" w:hAnsi="Times New Roman" w:eastAsia="Times New Roman" w:cs="Times New Roman"/>
+                <w:i w:val="false"/>
+                <w:b w:val="true"/>
+                <w:u w:val="none"/>
+                <w:strike w:val="false"/>
+                <w:sz w:val="18"/>
+                <w:szCs w:val="18"/>
+                <w:color w:val="000000"/>
+              </w:rPr>
+            </w:pPr>
+            <w:r>
+              <w:rPr>
+                <w:rFonts w:ascii="Times New Roman" w:hAnsi="Times New Roman" w:eastAsia="Times New Roman" w:cs="Times New Roman"/>
+                <w:i w:val="false"/>
+                <w:b w:val="true"/>
+                <w:u w:val="none"/>
+                <w:strike w:val="false"/>
+                <w:sz w:val="18"/>
+                <w:szCs w:val="18"/>
+                <w:color w:val="000000"/>
+              </w:rPr>
+              <w:t xml:space="preserve">1.90</w:t>
+            </w:r>
+          </w:p>
+        </w:tc>
+      </w:tr>
+    </w:tbl>
+    <w:p>
+      <w:pPr>
+        <w:jc w:val="left"/>
+        <w:pBdr>
+          <w:bottom w:val="none" w:sz="0" w:space="0" w:color="000000"/>
+          <w:top w:val="none" w:sz="0" w:space="0" w:color="000000"/>
+          <w:left w:val="none" w:sz="0" w:space="0" w:color="000000"/>
+          <w:right w:val="none" w:sz="0" w:space="0" w:color="000000"/>
+        </w:pBdr>
+        <w:spacing w:after="0" w:before="0" w:line="240"/>
+        <w:ind w:left="0" w:right="0" w:firstLine="0" w:firstLineChars="0"/>
+      </w:pPr>
+      <w:r>
+        <w:rPr>
+          <w:rFonts w:ascii="Times New Roman" w:hAnsi="Times New Roman" w:eastAsia="Times New Roman" w:cs="Times New Roman"/>
+          <w:i w:val="false"/>
+          <w:b w:val="false"/>
+          <w:u w:val="none"/>
+          <w:strike w:val="false"/>
+          <w:sz w:val="16"/>
+          <w:szCs w:val="16"/>
+          <w:color w:val="000000"/>
+        </w:rPr>
+        <w:t xml:space="preserve">Notes: averages of the annual growth rates over the years shown (Germany: 1991-2024), from the data of the regressions; productivity is exp(Log_MProductiv), exports are Exportman_GDP x GDP / 100. GIS and FRUK are unweighted averages of the countries.</w:t>
+      </w:r>
+    </w:p>
+    <w:p>
+      <w:pPr/>
+      <w:r>
+        <w:br w:type="page"/>
       </w:r>
     </w:p>
     <w:p>

</xml_diff>